<commit_message>
add: watcher-local.py & some fixed
</commit_message>
<xml_diff>
--- a/fastapi/chatbot/docs/B조_기능기획안.docx
+++ b/fastapi/chatbot/docs/B조_기능기획안.docx
@@ -86,7 +86,27 @@
           <w:szCs w:val="22"/>
           <w:lang w:eastAsia="ko-KR"/>
         </w:rPr>
-        <w:t xml:space="preserve"> AI기반 경제 뉴스분석 웹서비스</w:t>
+        <w:t xml:space="preserve"> AI기반 </w:t>
+      </w:r>
+      <w:r>
+        <w:rPr>
+          <w:rFonts w:asciiTheme="majorEastAsia" w:eastAsiaTheme="majorEastAsia" w:hAnsiTheme="majorEastAsia" w:hint="eastAsia"/>
+          <w:color w:val="000000" w:themeColor="text1"/>
+          <w:sz w:val="22"/>
+          <w:szCs w:val="22"/>
+          <w:lang w:eastAsia="ko-KR"/>
+        </w:rPr>
+        <w:t>사회/정치/스포츠</w:t>
+      </w:r>
+      <w:r>
+        <w:rPr>
+          <w:rFonts w:asciiTheme="majorEastAsia" w:eastAsiaTheme="majorEastAsia" w:hAnsiTheme="majorEastAsia"/>
+          <w:color w:val="000000" w:themeColor="text1"/>
+          <w:sz w:val="22"/>
+          <w:szCs w:val="22"/>
+          <w:lang w:eastAsia="ko-KR"/>
+        </w:rPr>
+        <w:t xml:space="preserve"> 뉴스분석 웹서비스</w:t>
       </w:r>
       <w:r>
         <w:rPr>
@@ -144,7 +164,6 @@
         </w:rPr>
       </w:pPr>
       <w:bookmarkStart w:id="1" w:name="기획-배경"/>
-      <w:proofErr w:type="spellStart"/>
       <w:r>
         <w:rPr>
           <w:rFonts w:asciiTheme="majorEastAsia" w:hAnsiTheme="majorEastAsia"/>
@@ -152,29 +171,8 @@
           <w:sz w:val="24"/>
           <w:szCs w:val="24"/>
         </w:rPr>
-        <w:t>기획</w:t>
-      </w:r>
-      <w:proofErr w:type="spellEnd"/>
-      <w:r>
-        <w:rPr>
-          <w:rFonts w:asciiTheme="majorEastAsia" w:hAnsiTheme="majorEastAsia"/>
-          <w:color w:val="000000" w:themeColor="text1"/>
-          <w:sz w:val="24"/>
-          <w:szCs w:val="24"/>
-        </w:rPr>
-        <w:t xml:space="preserve"> </w:t>
-      </w:r>
-      <w:proofErr w:type="spellStart"/>
-      <w:r>
-        <w:rPr>
-          <w:rFonts w:asciiTheme="majorEastAsia" w:hAnsiTheme="majorEastAsia"/>
-          <w:color w:val="000000" w:themeColor="text1"/>
-          <w:sz w:val="24"/>
-          <w:szCs w:val="24"/>
-        </w:rPr>
-        <w:t>배경</w:t>
-      </w:r>
-      <w:proofErr w:type="spellEnd"/>
+        <w:t>기획 배경</w:t>
+      </w:r>
     </w:p>
     <w:p>
       <w:pPr>
@@ -217,27 +215,15 @@
           <w:lang w:eastAsia="ko-KR"/>
         </w:rPr>
       </w:pPr>
-      <w:proofErr w:type="spellStart"/>
-      <w:r>
-        <w:rPr>
-          <w:rFonts w:asciiTheme="majorEastAsia" w:eastAsiaTheme="majorEastAsia" w:hAnsiTheme="majorEastAsia"/>
-          <w:color w:val="000000" w:themeColor="text1"/>
-          <w:sz w:val="22"/>
-          <w:szCs w:val="22"/>
-          <w:lang w:eastAsia="ko-KR"/>
-        </w:rPr>
-        <w:t>뉴스량이</w:t>
-      </w:r>
-      <w:proofErr w:type="spellEnd"/>
-      <w:r>
-        <w:rPr>
-          <w:rFonts w:asciiTheme="majorEastAsia" w:eastAsiaTheme="majorEastAsia" w:hAnsiTheme="majorEastAsia"/>
-          <w:color w:val="000000" w:themeColor="text1"/>
-          <w:sz w:val="22"/>
-          <w:szCs w:val="22"/>
-          <w:lang w:eastAsia="ko-KR"/>
-        </w:rPr>
-        <w:t xml:space="preserve"> 많아 핵심 이슈 파악이 어려움</w:t>
+      <w:r>
+        <w:rPr>
+          <w:rFonts w:asciiTheme="majorEastAsia" w:eastAsiaTheme="majorEastAsia" w:hAnsiTheme="majorEastAsia"/>
+          <w:color w:val="000000" w:themeColor="text1"/>
+          <w:sz w:val="22"/>
+          <w:szCs w:val="22"/>
+          <w:lang w:eastAsia="ko-KR"/>
+        </w:rPr>
+        <w:t>뉴스량이 많아 핵심 이슈 파악이 어려움</w:t>
       </w:r>
       <w:r>
         <w:rPr>
@@ -618,7 +604,7 @@
       <w:pPr>
         <w:pStyle w:val="FirstParagraph"/>
         <w:rPr>
-          <w:rFonts w:asciiTheme="majorEastAsia" w:eastAsiaTheme="majorEastAsia" w:hAnsiTheme="majorEastAsia"/>
+          <w:rFonts w:asciiTheme="majorEastAsia" w:eastAsiaTheme="majorEastAsia" w:hAnsiTheme="majorEastAsia" w:hint="eastAsia"/>
           <w:color w:val="000000" w:themeColor="text1"/>
           <w:sz w:val="22"/>
           <w:szCs w:val="22"/>
@@ -701,114 +687,72 @@
           <w:szCs w:val="22"/>
           <w:lang w:eastAsia="ko-KR"/>
         </w:rPr>
+        <w:t xml:space="preserve"> 으로, 뉴스데이터, GPT 모델의 </w:t>
+      </w:r>
+      <w:r>
+        <w:rPr>
+          <w:rFonts w:asciiTheme="majorEastAsia" w:eastAsiaTheme="majorEastAsia" w:hAnsiTheme="majorEastAsia"/>
+          <w:color w:val="000000" w:themeColor="text1"/>
+          <w:sz w:val="22"/>
+          <w:szCs w:val="22"/>
+          <w:lang w:eastAsia="ko-KR"/>
+        </w:rPr>
+        <w:br/>
+      </w:r>
+      <w:r>
+        <w:rPr>
+          <w:rFonts w:asciiTheme="majorEastAsia" w:eastAsiaTheme="majorEastAsia" w:hAnsiTheme="majorEastAsia"/>
+          <w:color w:val="000000" w:themeColor="text1"/>
+          <w:sz w:val="22"/>
+          <w:szCs w:val="22"/>
+          <w:lang w:eastAsia="ko-KR"/>
+        </w:rPr>
+        <w:t xml:space="preserve">사전지식, 사용자 로그(관심 분야, 클릭 기록 등)를 결합하여 사용자에게 </w:t>
+      </w:r>
+      <w:r>
+        <w:rPr>
+          <w:rFonts w:asciiTheme="majorEastAsia" w:eastAsiaTheme="majorEastAsia" w:hAnsiTheme="majorEastAsia"/>
+          <w:b/>
+          <w:bCs/>
+          <w:color w:val="000000" w:themeColor="text1"/>
+          <w:sz w:val="22"/>
+          <w:szCs w:val="22"/>
+          <w:lang w:eastAsia="ko-KR"/>
+        </w:rPr>
+        <w:t>개인화된 경제 정보</w:t>
+      </w:r>
+      <w:r>
+        <w:rPr>
+          <w:rFonts w:asciiTheme="majorEastAsia" w:eastAsiaTheme="majorEastAsia" w:hAnsiTheme="majorEastAsia"/>
+          <w:color w:val="000000" w:themeColor="text1"/>
+          <w:sz w:val="22"/>
+          <w:szCs w:val="22"/>
+          <w:lang w:eastAsia="ko-KR"/>
+        </w:rPr>
+        <w:t>를 제공한다.</w:t>
+      </w:r>
+      <w:r>
+        <w:rPr>
+          <w:rFonts w:asciiTheme="majorEastAsia" w:eastAsiaTheme="majorEastAsia" w:hAnsiTheme="majorEastAsia" w:hint="eastAsia"/>
+          <w:color w:val="000000" w:themeColor="text1"/>
+          <w:sz w:val="22"/>
+          <w:szCs w:val="22"/>
+          <w:lang w:eastAsia="ko-KR"/>
+        </w:rPr>
         <w:t xml:space="preserve"> </w:t>
       </w:r>
-      <w:proofErr w:type="spellStart"/>
-      <w:r>
-        <w:rPr>
-          <w:rFonts w:asciiTheme="majorEastAsia" w:eastAsiaTheme="majorEastAsia" w:hAnsiTheme="majorEastAsia"/>
-          <w:color w:val="000000" w:themeColor="text1"/>
-          <w:sz w:val="22"/>
-          <w:szCs w:val="22"/>
-          <w:lang w:eastAsia="ko-KR"/>
-        </w:rPr>
-        <w:t>으로</w:t>
-      </w:r>
-      <w:proofErr w:type="spellEnd"/>
-      <w:r>
-        <w:rPr>
-          <w:rFonts w:asciiTheme="majorEastAsia" w:eastAsiaTheme="majorEastAsia" w:hAnsiTheme="majorEastAsia"/>
-          <w:color w:val="000000" w:themeColor="text1"/>
-          <w:sz w:val="22"/>
-          <w:szCs w:val="22"/>
-          <w:lang w:eastAsia="ko-KR"/>
-        </w:rPr>
-        <w:t xml:space="preserve">, 뉴스데이터, GPT 모델의 </w:t>
-      </w:r>
-      <w:r>
-        <w:rPr>
-          <w:rFonts w:asciiTheme="majorEastAsia" w:eastAsiaTheme="majorEastAsia" w:hAnsiTheme="majorEastAsia"/>
-          <w:color w:val="000000" w:themeColor="text1"/>
-          <w:sz w:val="22"/>
-          <w:szCs w:val="22"/>
-          <w:lang w:eastAsia="ko-KR"/>
-        </w:rPr>
-        <w:br/>
-      </w:r>
-      <w:r>
-        <w:rPr>
-          <w:rFonts w:asciiTheme="majorEastAsia" w:eastAsiaTheme="majorEastAsia" w:hAnsiTheme="majorEastAsia"/>
-          <w:color w:val="000000" w:themeColor="text1"/>
-          <w:sz w:val="22"/>
-          <w:szCs w:val="22"/>
-          <w:lang w:eastAsia="ko-KR"/>
-        </w:rPr>
-        <w:t>사전지식, 사용자 로그(관심 분야, 클릭 기록 등)</w:t>
-      </w:r>
-      <w:proofErr w:type="spellStart"/>
-      <w:r>
-        <w:rPr>
-          <w:rFonts w:asciiTheme="majorEastAsia" w:eastAsiaTheme="majorEastAsia" w:hAnsiTheme="majorEastAsia"/>
-          <w:color w:val="000000" w:themeColor="text1"/>
-          <w:sz w:val="22"/>
-          <w:szCs w:val="22"/>
-          <w:lang w:eastAsia="ko-KR"/>
-        </w:rPr>
-        <w:t>를</w:t>
-      </w:r>
-      <w:proofErr w:type="spellEnd"/>
-      <w:r>
-        <w:rPr>
-          <w:rFonts w:asciiTheme="majorEastAsia" w:eastAsiaTheme="majorEastAsia" w:hAnsiTheme="majorEastAsia"/>
-          <w:color w:val="000000" w:themeColor="text1"/>
-          <w:sz w:val="22"/>
-          <w:szCs w:val="22"/>
-          <w:lang w:eastAsia="ko-KR"/>
-        </w:rPr>
-        <w:t xml:space="preserve"> 결합하여 사용자에게 </w:t>
-      </w:r>
-      <w:r>
-        <w:rPr>
-          <w:rFonts w:asciiTheme="majorEastAsia" w:eastAsiaTheme="majorEastAsia" w:hAnsiTheme="majorEastAsia"/>
-          <w:b/>
-          <w:bCs/>
-          <w:color w:val="000000" w:themeColor="text1"/>
-          <w:sz w:val="22"/>
-          <w:szCs w:val="22"/>
-          <w:lang w:eastAsia="ko-KR"/>
-        </w:rPr>
-        <w:t>개인화된 경제 정보</w:t>
-      </w:r>
-      <w:r>
-        <w:rPr>
-          <w:rFonts w:asciiTheme="majorEastAsia" w:eastAsiaTheme="majorEastAsia" w:hAnsiTheme="majorEastAsia"/>
-          <w:color w:val="000000" w:themeColor="text1"/>
-          <w:sz w:val="22"/>
-          <w:szCs w:val="22"/>
-          <w:lang w:eastAsia="ko-KR"/>
-        </w:rPr>
-        <w:t>를 제공한다.</w:t>
-      </w:r>
-      <w:r>
-        <w:rPr>
-          <w:rFonts w:asciiTheme="majorEastAsia" w:eastAsiaTheme="majorEastAsia" w:hAnsiTheme="majorEastAsia" w:hint="eastAsia"/>
-          <w:color w:val="000000" w:themeColor="text1"/>
-          <w:sz w:val="22"/>
-          <w:szCs w:val="22"/>
-          <w:lang w:eastAsia="ko-KR"/>
-        </w:rPr>
-        <w:t xml:space="preserve"> </w:t>
-      </w:r>
-      <w:r>
-        <w:rPr>
-          <w:rFonts w:asciiTheme="majorEastAsia" w:eastAsiaTheme="majorEastAsia" w:hAnsiTheme="majorEastAsia"/>
-          <w:color w:val="000000" w:themeColor="text1"/>
-          <w:sz w:val="22"/>
-          <w:szCs w:val="22"/>
-          <w:lang w:eastAsia="ko-KR"/>
-        </w:rPr>
-        <w:t>이 시스템은 “AI가 대신 요약하고 설명해주는 분석 도우미” 역할을 수행한다.</w:t>
-      </w:r>
+      <w:r>
+        <w:rPr>
+          <w:rFonts w:asciiTheme="majorEastAsia" w:eastAsiaTheme="majorEastAsia" w:hAnsiTheme="majorEastAsia"/>
+          <w:color w:val="000000" w:themeColor="text1"/>
+          <w:sz w:val="22"/>
+          <w:szCs w:val="22"/>
+          <w:lang w:eastAsia="ko-KR"/>
+        </w:rPr>
+        <w:t>이 시스템은 “AI가 대신 요약하고 설명해주는 분석 도우미” 역할을 수행한다</w:t>
+      </w:r>
+      <w:bookmarkStart w:id="6" w:name="데이터-소스-및-분석-계획"/>
+      <w:bookmarkEnd w:id="5"/>
     </w:p>
     <w:p>
       <w:pPr>
@@ -821,8 +765,6 @@
           <w:lang w:eastAsia="ko-KR"/>
         </w:rPr>
       </w:pPr>
-      <w:bookmarkStart w:id="6" w:name="데이터-소스-및-분석-계획"/>
-      <w:bookmarkEnd w:id="5"/>
       <w:r>
         <w:rPr>
           <w:rFonts w:asciiTheme="majorEastAsia" w:hAnsiTheme="majorEastAsia"/>
@@ -945,7 +887,6 @@
       </w:pPr>
       <w:bookmarkStart w:id="8" w:name="분석-계획"/>
       <w:bookmarkEnd w:id="7"/>
-      <w:proofErr w:type="spellStart"/>
       <w:r>
         <w:rPr>
           <w:rFonts w:asciiTheme="majorEastAsia" w:hAnsiTheme="majorEastAsia"/>
@@ -954,19 +895,151 @@
           <w:szCs w:val="24"/>
         </w:rPr>
         <w:lastRenderedPageBreak/>
-        <w:t>분석</w:t>
-      </w:r>
-      <w:proofErr w:type="spellEnd"/>
-      <w:r>
+        <w:t>분석 계획</w:t>
+      </w:r>
+    </w:p>
+    <w:p>
+      <w:pPr>
+        <w:pStyle w:val="Compact"/>
+        <w:numPr>
+          <w:ilvl w:val="0"/>
+          <w:numId w:val="6"/>
+        </w:numPr>
+        <w:rPr>
+          <w:rFonts w:asciiTheme="majorEastAsia" w:eastAsiaTheme="majorEastAsia" w:hAnsiTheme="majorEastAsia"/>
+          <w:color w:val="000000" w:themeColor="text1"/>
+          <w:sz w:val="22"/>
+          <w:szCs w:val="22"/>
+          <w:lang w:eastAsia="ko-KR"/>
+        </w:rPr>
+      </w:pPr>
+      <w:r>
+        <w:rPr>
+          <w:rFonts w:asciiTheme="majorEastAsia" w:eastAsiaTheme="majorEastAsia" w:hAnsiTheme="majorEastAsia"/>
+          <w:color w:val="000000" w:themeColor="text1"/>
+          <w:sz w:val="22"/>
+          <w:szCs w:val="22"/>
+          <w:lang w:eastAsia="ko-KR"/>
+        </w:rPr>
+        <w:t>주요 분야별 뉴스 언급량 변화 (증권, 금융, 부동산, 산업, 글로벌)</w:t>
+      </w:r>
+    </w:p>
+    <w:p>
+      <w:pPr>
+        <w:pStyle w:val="Compact"/>
+        <w:numPr>
+          <w:ilvl w:val="0"/>
+          <w:numId w:val="6"/>
+        </w:numPr>
+        <w:rPr>
+          <w:rFonts w:asciiTheme="majorEastAsia" w:eastAsiaTheme="majorEastAsia" w:hAnsiTheme="majorEastAsia"/>
+          <w:color w:val="000000" w:themeColor="text1"/>
+          <w:sz w:val="22"/>
+          <w:szCs w:val="22"/>
+          <w:lang w:eastAsia="ko-KR"/>
+        </w:rPr>
+      </w:pPr>
+      <w:r>
+        <w:rPr>
+          <w:rFonts w:asciiTheme="majorEastAsia" w:eastAsiaTheme="majorEastAsia" w:hAnsiTheme="majorEastAsia"/>
+          <w:color w:val="000000" w:themeColor="text1"/>
+          <w:sz w:val="22"/>
+          <w:szCs w:val="22"/>
+          <w:lang w:eastAsia="ko-KR"/>
+        </w:rPr>
+        <w:t>기간별 키워드 순위 및 급등 단어 탐지</w:t>
+      </w:r>
+    </w:p>
+    <w:p>
+      <w:pPr>
+        <w:pStyle w:val="Compact"/>
+        <w:numPr>
+          <w:ilvl w:val="0"/>
+          <w:numId w:val="6"/>
+        </w:numPr>
+        <w:rPr>
+          <w:rFonts w:asciiTheme="majorEastAsia" w:eastAsiaTheme="majorEastAsia" w:hAnsiTheme="majorEastAsia"/>
+          <w:color w:val="000000" w:themeColor="text1"/>
+          <w:sz w:val="22"/>
+          <w:szCs w:val="22"/>
+          <w:lang w:eastAsia="ko-KR"/>
+        </w:rPr>
+      </w:pPr>
+      <w:r>
+        <w:rPr>
+          <w:rFonts w:asciiTheme="majorEastAsia" w:eastAsiaTheme="majorEastAsia" w:hAnsiTheme="majorEastAsia"/>
+          <w:color w:val="000000" w:themeColor="text1"/>
+          <w:sz w:val="22"/>
+          <w:szCs w:val="22"/>
+          <w:lang w:eastAsia="ko-KR"/>
+        </w:rPr>
+        <w:t>일별 감성 변화 및 긍/부정 추이</w:t>
+      </w:r>
+    </w:p>
+    <w:p>
+      <w:pPr>
+        <w:pStyle w:val="Compact"/>
+        <w:numPr>
+          <w:ilvl w:val="0"/>
+          <w:numId w:val="6"/>
+        </w:numPr>
+        <w:rPr>
+          <w:rFonts w:asciiTheme="majorEastAsia" w:eastAsiaTheme="majorEastAsia" w:hAnsiTheme="majorEastAsia"/>
+          <w:color w:val="000000" w:themeColor="text1"/>
+          <w:sz w:val="22"/>
+          <w:szCs w:val="22"/>
+          <w:lang w:eastAsia="ko-KR"/>
+        </w:rPr>
+      </w:pPr>
+      <w:r>
+        <w:rPr>
+          <w:rFonts w:asciiTheme="majorEastAsia" w:eastAsiaTheme="majorEastAsia" w:hAnsiTheme="majorEastAsia"/>
+          <w:color w:val="000000" w:themeColor="text1"/>
+          <w:sz w:val="22"/>
+          <w:szCs w:val="22"/>
+          <w:lang w:eastAsia="ko-KR"/>
+        </w:rPr>
+        <w:t>유튜브 댓글 오피니언 마이닝 및 핵심 단어 추출</w:t>
+      </w:r>
+    </w:p>
+    <w:p>
+      <w:pPr>
+        <w:pStyle w:val="Compact"/>
+        <w:numPr>
+          <w:ilvl w:val="0"/>
+          <w:numId w:val="6"/>
+        </w:numPr>
+        <w:rPr>
+          <w:rFonts w:asciiTheme="majorEastAsia" w:eastAsiaTheme="majorEastAsia" w:hAnsiTheme="majorEastAsia"/>
+          <w:color w:val="000000" w:themeColor="text1"/>
+          <w:sz w:val="22"/>
+          <w:szCs w:val="22"/>
+          <w:lang w:eastAsia="ko-KR"/>
+        </w:rPr>
+      </w:pPr>
+      <w:r>
+        <w:rPr>
+          <w:rFonts w:asciiTheme="majorEastAsia" w:eastAsiaTheme="majorEastAsia" w:hAnsiTheme="majorEastAsia"/>
+          <w:color w:val="000000" w:themeColor="text1"/>
+          <w:sz w:val="22"/>
+          <w:szCs w:val="22"/>
+          <w:lang w:eastAsia="ko-KR"/>
+        </w:rPr>
+        <w:t>GPT 기반 기사 클러스터링 및 주제 라벨링</w:t>
+      </w:r>
+    </w:p>
+    <w:p>
+      <w:pPr>
+        <w:pStyle w:val="2"/>
         <w:rPr>
           <w:rFonts w:asciiTheme="majorEastAsia" w:hAnsiTheme="majorEastAsia"/>
           <w:color w:val="000000" w:themeColor="text1"/>
           <w:sz w:val="24"/>
           <w:szCs w:val="24"/>
         </w:rPr>
-        <w:t xml:space="preserve"> </w:t>
-      </w:r>
-      <w:proofErr w:type="spellStart"/>
+      </w:pPr>
+      <w:bookmarkStart w:id="9" w:name="시각화"/>
+      <w:bookmarkEnd w:id="8"/>
       <w:r>
         <w:rPr>
           <w:rFonts w:asciiTheme="majorEastAsia" w:hAnsiTheme="majorEastAsia"/>
@@ -974,219 +1047,8 @@
           <w:sz w:val="24"/>
           <w:szCs w:val="24"/>
         </w:rPr>
-        <w:t>계획</w:t>
-      </w:r>
-      <w:proofErr w:type="spellEnd"/>
-    </w:p>
-    <w:p>
-      <w:pPr>
-        <w:pStyle w:val="Compact"/>
-        <w:numPr>
-          <w:ilvl w:val="0"/>
-          <w:numId w:val="6"/>
-        </w:numPr>
-        <w:rPr>
-          <w:rFonts w:asciiTheme="majorEastAsia" w:eastAsiaTheme="majorEastAsia" w:hAnsiTheme="majorEastAsia"/>
-          <w:color w:val="000000" w:themeColor="text1"/>
-          <w:sz w:val="22"/>
-          <w:szCs w:val="22"/>
-          <w:lang w:eastAsia="ko-KR"/>
-        </w:rPr>
-      </w:pPr>
-      <w:r>
-        <w:rPr>
-          <w:rFonts w:asciiTheme="majorEastAsia" w:eastAsiaTheme="majorEastAsia" w:hAnsiTheme="majorEastAsia"/>
-          <w:color w:val="000000" w:themeColor="text1"/>
-          <w:sz w:val="22"/>
-          <w:szCs w:val="22"/>
-          <w:lang w:eastAsia="ko-KR"/>
-        </w:rPr>
-        <w:t xml:space="preserve">주요 분야별 뉴스 </w:t>
-      </w:r>
-      <w:proofErr w:type="spellStart"/>
-      <w:r>
-        <w:rPr>
-          <w:rFonts w:asciiTheme="majorEastAsia" w:eastAsiaTheme="majorEastAsia" w:hAnsiTheme="majorEastAsia"/>
-          <w:color w:val="000000" w:themeColor="text1"/>
-          <w:sz w:val="22"/>
-          <w:szCs w:val="22"/>
-          <w:lang w:eastAsia="ko-KR"/>
-        </w:rPr>
-        <w:t>언급량</w:t>
-      </w:r>
-      <w:proofErr w:type="spellEnd"/>
-      <w:r>
-        <w:rPr>
-          <w:rFonts w:asciiTheme="majorEastAsia" w:eastAsiaTheme="majorEastAsia" w:hAnsiTheme="majorEastAsia"/>
-          <w:color w:val="000000" w:themeColor="text1"/>
-          <w:sz w:val="22"/>
-          <w:szCs w:val="22"/>
-          <w:lang w:eastAsia="ko-KR"/>
-        </w:rPr>
-        <w:t xml:space="preserve"> 변화 (증권, 금융, 부동산, 산업, 글로벌)</w:t>
-      </w:r>
-    </w:p>
-    <w:p>
-      <w:pPr>
-        <w:pStyle w:val="Compact"/>
-        <w:numPr>
-          <w:ilvl w:val="0"/>
-          <w:numId w:val="6"/>
-        </w:numPr>
-        <w:rPr>
-          <w:rFonts w:asciiTheme="majorEastAsia" w:eastAsiaTheme="majorEastAsia" w:hAnsiTheme="majorEastAsia"/>
-          <w:color w:val="000000" w:themeColor="text1"/>
-          <w:sz w:val="22"/>
-          <w:szCs w:val="22"/>
-          <w:lang w:eastAsia="ko-KR"/>
-        </w:rPr>
-      </w:pPr>
-      <w:r>
-        <w:rPr>
-          <w:rFonts w:asciiTheme="majorEastAsia" w:eastAsiaTheme="majorEastAsia" w:hAnsiTheme="majorEastAsia"/>
-          <w:color w:val="000000" w:themeColor="text1"/>
-          <w:sz w:val="22"/>
-          <w:szCs w:val="22"/>
-          <w:lang w:eastAsia="ko-KR"/>
-        </w:rPr>
-        <w:t>기간별 키워드 순위 및 급등 단어 탐지</w:t>
-      </w:r>
-    </w:p>
-    <w:p>
-      <w:pPr>
-        <w:pStyle w:val="Compact"/>
-        <w:numPr>
-          <w:ilvl w:val="0"/>
-          <w:numId w:val="6"/>
-        </w:numPr>
-        <w:rPr>
-          <w:rFonts w:asciiTheme="majorEastAsia" w:eastAsiaTheme="majorEastAsia" w:hAnsiTheme="majorEastAsia"/>
-          <w:color w:val="000000" w:themeColor="text1"/>
-          <w:sz w:val="22"/>
-          <w:szCs w:val="22"/>
-          <w:lang w:eastAsia="ko-KR"/>
-        </w:rPr>
-      </w:pPr>
-      <w:r>
-        <w:rPr>
-          <w:rFonts w:asciiTheme="majorEastAsia" w:eastAsiaTheme="majorEastAsia" w:hAnsiTheme="majorEastAsia"/>
-          <w:color w:val="000000" w:themeColor="text1"/>
-          <w:sz w:val="22"/>
-          <w:szCs w:val="22"/>
-          <w:lang w:eastAsia="ko-KR"/>
-        </w:rPr>
-        <w:t xml:space="preserve">일별 감성 변화 및 </w:t>
-      </w:r>
-      <w:proofErr w:type="spellStart"/>
-      <w:r>
-        <w:rPr>
-          <w:rFonts w:asciiTheme="majorEastAsia" w:eastAsiaTheme="majorEastAsia" w:hAnsiTheme="majorEastAsia"/>
-          <w:color w:val="000000" w:themeColor="text1"/>
-          <w:sz w:val="22"/>
-          <w:szCs w:val="22"/>
-          <w:lang w:eastAsia="ko-KR"/>
-        </w:rPr>
-        <w:t>긍</w:t>
-      </w:r>
-      <w:proofErr w:type="spellEnd"/>
-      <w:r>
-        <w:rPr>
-          <w:rFonts w:asciiTheme="majorEastAsia" w:eastAsiaTheme="majorEastAsia" w:hAnsiTheme="majorEastAsia"/>
-          <w:color w:val="000000" w:themeColor="text1"/>
-          <w:sz w:val="22"/>
-          <w:szCs w:val="22"/>
-          <w:lang w:eastAsia="ko-KR"/>
-        </w:rPr>
-        <w:t>/부정 추이</w:t>
-      </w:r>
-    </w:p>
-    <w:p>
-      <w:pPr>
-        <w:pStyle w:val="Compact"/>
-        <w:numPr>
-          <w:ilvl w:val="0"/>
-          <w:numId w:val="6"/>
-        </w:numPr>
-        <w:rPr>
-          <w:rFonts w:asciiTheme="majorEastAsia" w:eastAsiaTheme="majorEastAsia" w:hAnsiTheme="majorEastAsia"/>
-          <w:color w:val="000000" w:themeColor="text1"/>
-          <w:sz w:val="22"/>
-          <w:szCs w:val="22"/>
-          <w:lang w:eastAsia="ko-KR"/>
-        </w:rPr>
-      </w:pPr>
-      <w:r>
-        <w:rPr>
-          <w:rFonts w:asciiTheme="majorEastAsia" w:eastAsiaTheme="majorEastAsia" w:hAnsiTheme="majorEastAsia"/>
-          <w:color w:val="000000" w:themeColor="text1"/>
-          <w:sz w:val="22"/>
-          <w:szCs w:val="22"/>
-          <w:lang w:eastAsia="ko-KR"/>
-        </w:rPr>
-        <w:t>유튜브 댓글 오피니언 마이닝 및 핵심 단어 추출</w:t>
-      </w:r>
-    </w:p>
-    <w:p>
-      <w:pPr>
-        <w:pStyle w:val="Compact"/>
-        <w:numPr>
-          <w:ilvl w:val="0"/>
-          <w:numId w:val="6"/>
-        </w:numPr>
-        <w:rPr>
-          <w:rFonts w:asciiTheme="majorEastAsia" w:eastAsiaTheme="majorEastAsia" w:hAnsiTheme="majorEastAsia"/>
-          <w:color w:val="000000" w:themeColor="text1"/>
-          <w:sz w:val="22"/>
-          <w:szCs w:val="22"/>
-          <w:lang w:eastAsia="ko-KR"/>
-        </w:rPr>
-      </w:pPr>
-      <w:r>
-        <w:rPr>
-          <w:rFonts w:asciiTheme="majorEastAsia" w:eastAsiaTheme="majorEastAsia" w:hAnsiTheme="majorEastAsia"/>
-          <w:color w:val="000000" w:themeColor="text1"/>
-          <w:sz w:val="22"/>
-          <w:szCs w:val="22"/>
-          <w:lang w:eastAsia="ko-KR"/>
-        </w:rPr>
-        <w:t xml:space="preserve">GPT 기반 기사 클러스터링 및 주제 </w:t>
-      </w:r>
-      <w:proofErr w:type="spellStart"/>
-      <w:r>
-        <w:rPr>
-          <w:rFonts w:asciiTheme="majorEastAsia" w:eastAsiaTheme="majorEastAsia" w:hAnsiTheme="majorEastAsia"/>
-          <w:color w:val="000000" w:themeColor="text1"/>
-          <w:sz w:val="22"/>
-          <w:szCs w:val="22"/>
-          <w:lang w:eastAsia="ko-KR"/>
-        </w:rPr>
-        <w:t>라벨링</w:t>
-      </w:r>
-      <w:proofErr w:type="spellEnd"/>
-    </w:p>
-    <w:p>
-      <w:pPr>
-        <w:pStyle w:val="2"/>
-        <w:rPr>
-          <w:rFonts w:asciiTheme="majorEastAsia" w:hAnsiTheme="majorEastAsia"/>
-          <w:color w:val="000000" w:themeColor="text1"/>
-          <w:sz w:val="24"/>
-          <w:szCs w:val="24"/>
-        </w:rPr>
-      </w:pPr>
-      <w:bookmarkStart w:id="9" w:name="시각화"/>
-      <w:bookmarkEnd w:id="8"/>
-      <w:proofErr w:type="spellStart"/>
-      <w:r>
-        <w:rPr>
-          <w:rFonts w:asciiTheme="majorEastAsia" w:hAnsiTheme="majorEastAsia"/>
-          <w:color w:val="000000" w:themeColor="text1"/>
-          <w:sz w:val="24"/>
-          <w:szCs w:val="24"/>
-        </w:rPr>
         <w:t>시각화</w:t>
       </w:r>
-      <w:proofErr w:type="spellEnd"/>
     </w:p>
     <w:p>
       <w:pPr>
@@ -1211,45 +1073,11 @@
           <w:szCs w:val="22"/>
           <w:lang w:eastAsia="ko-KR"/>
         </w:rPr>
-        <w:t xml:space="preserve">시계열 그래프, 순위 리스트, 감성 게이지, 파이차트, </w:t>
-      </w:r>
-      <w:proofErr w:type="spellStart"/>
-      <w:r>
-        <w:rPr>
-          <w:rFonts w:asciiTheme="majorEastAsia" w:eastAsiaTheme="majorEastAsia" w:hAnsiTheme="majorEastAsia"/>
-          <w:color w:val="000000" w:themeColor="text1"/>
-          <w:sz w:val="22"/>
-          <w:szCs w:val="22"/>
-          <w:lang w:eastAsia="ko-KR"/>
-        </w:rPr>
-        <w:t>워드클라우드</w:t>
-      </w:r>
-      <w:proofErr w:type="spellEnd"/>
-      <w:r>
-        <w:rPr>
-          <w:rFonts w:asciiTheme="majorEastAsia" w:eastAsiaTheme="majorEastAsia" w:hAnsiTheme="majorEastAsia"/>
-          <w:color w:val="000000" w:themeColor="text1"/>
-          <w:sz w:val="22"/>
-          <w:szCs w:val="22"/>
-          <w:lang w:eastAsia="ko-KR"/>
-        </w:rPr>
-        <w:t xml:space="preserve">, </w:t>
-      </w:r>
-      <w:proofErr w:type="spellStart"/>
-      <w:r>
-        <w:rPr>
-          <w:rFonts w:asciiTheme="majorEastAsia" w:eastAsiaTheme="majorEastAsia" w:hAnsiTheme="majorEastAsia"/>
-          <w:color w:val="000000" w:themeColor="text1"/>
-          <w:sz w:val="22"/>
-          <w:szCs w:val="22"/>
-          <w:lang w:eastAsia="ko-KR"/>
-        </w:rPr>
-        <w:t>트리맵</w:t>
+        <w:t>시계열 그래프, 순위 리스트, 감성 게이지, 파이차트, 워드클라우드, 트리맵</w:t>
       </w:r>
       <w:bookmarkStart w:id="10" w:name="주요-기능-개요"/>
       <w:bookmarkEnd w:id="6"/>
       <w:bookmarkEnd w:id="9"/>
-      <w:proofErr w:type="spellEnd"/>
     </w:p>
     <w:p>
       <w:pPr>
@@ -1337,27 +1165,15 @@
           <w:lang w:eastAsia="ko-KR"/>
         </w:rPr>
       </w:pPr>
-      <w:proofErr w:type="spellStart"/>
-      <w:r>
-        <w:rPr>
-          <w:rFonts w:asciiTheme="majorEastAsia" w:eastAsiaTheme="majorEastAsia" w:hAnsiTheme="majorEastAsia"/>
-          <w:color w:val="000000" w:themeColor="text1"/>
-          <w:sz w:val="22"/>
-          <w:szCs w:val="22"/>
-          <w:lang w:eastAsia="ko-KR"/>
-        </w:rPr>
-        <w:t>기사별</w:t>
-      </w:r>
-      <w:proofErr w:type="spellEnd"/>
-      <w:r>
-        <w:rPr>
-          <w:rFonts w:asciiTheme="majorEastAsia" w:eastAsiaTheme="majorEastAsia" w:hAnsiTheme="majorEastAsia"/>
-          <w:color w:val="000000" w:themeColor="text1"/>
-          <w:sz w:val="22"/>
-          <w:szCs w:val="22"/>
-          <w:lang w:eastAsia="ko-KR"/>
-        </w:rPr>
-        <w:t xml:space="preserve"> </w:t>
+      <w:r>
+        <w:rPr>
+          <w:rFonts w:asciiTheme="majorEastAsia" w:eastAsiaTheme="majorEastAsia" w:hAnsiTheme="majorEastAsia"/>
+          <w:color w:val="000000" w:themeColor="text1"/>
+          <w:sz w:val="22"/>
+          <w:szCs w:val="22"/>
+          <w:lang w:eastAsia="ko-KR"/>
+        </w:rPr>
+        <w:t xml:space="preserve">기사별 </w:t>
       </w:r>
       <w:r>
         <w:rPr>
@@ -1405,29 +1221,7 @@
           <w:szCs w:val="22"/>
           <w:lang w:eastAsia="ko-KR"/>
         </w:rPr>
-        <w:t>색상/</w:t>
-      </w:r>
-      <w:proofErr w:type="spellStart"/>
-      <w:r>
-        <w:rPr>
-          <w:rFonts w:asciiTheme="majorEastAsia" w:eastAsiaTheme="majorEastAsia" w:hAnsiTheme="majorEastAsia"/>
-          <w:color w:val="000000" w:themeColor="text1"/>
-          <w:sz w:val="22"/>
-          <w:szCs w:val="22"/>
-          <w:lang w:eastAsia="ko-KR"/>
-        </w:rPr>
-        <w:t>이모티콘으로</w:t>
-      </w:r>
-      <w:proofErr w:type="spellEnd"/>
-      <w:r>
-        <w:rPr>
-          <w:rFonts w:asciiTheme="majorEastAsia" w:eastAsiaTheme="majorEastAsia" w:hAnsiTheme="majorEastAsia"/>
-          <w:color w:val="000000" w:themeColor="text1"/>
-          <w:sz w:val="22"/>
-          <w:szCs w:val="22"/>
-          <w:lang w:eastAsia="ko-KR"/>
-        </w:rPr>
-        <w:t xml:space="preserve"> 가독성 강화</w:t>
+        <w:t>색상/이모티콘으로 가독성 강화</w:t>
       </w:r>
     </w:p>
     <w:p>
@@ -1493,7 +1287,6 @@
           <w:szCs w:val="24"/>
         </w:rPr>
       </w:pPr>
-      <w:proofErr w:type="spellStart"/>
       <w:r>
         <w:rPr>
           <w:rFonts w:asciiTheme="majorEastAsia" w:hAnsiTheme="majorEastAsia"/>
@@ -1501,19 +1294,86 @@
           <w:sz w:val="24"/>
           <w:szCs w:val="24"/>
         </w:rPr>
-        <w:t>감성</w:t>
-      </w:r>
-      <w:proofErr w:type="spellEnd"/>
-      <w:r>
+        <w:t>감성 추이 시각화</w:t>
+      </w:r>
+    </w:p>
+    <w:p>
+      <w:pPr>
+        <w:pStyle w:val="Compact"/>
+        <w:numPr>
+          <w:ilvl w:val="0"/>
+          <w:numId w:val="9"/>
+        </w:numPr>
+        <w:rPr>
+          <w:rFonts w:asciiTheme="majorEastAsia" w:eastAsiaTheme="majorEastAsia" w:hAnsiTheme="majorEastAsia"/>
+          <w:color w:val="000000" w:themeColor="text1"/>
+          <w:sz w:val="22"/>
+          <w:szCs w:val="22"/>
+          <w:lang w:eastAsia="ko-KR"/>
+        </w:rPr>
+      </w:pPr>
+      <w:r>
+        <w:rPr>
+          <w:rFonts w:asciiTheme="majorEastAsia" w:eastAsiaTheme="majorEastAsia" w:hAnsiTheme="majorEastAsia"/>
+          <w:color w:val="000000" w:themeColor="text1"/>
+          <w:sz w:val="22"/>
+          <w:szCs w:val="22"/>
+          <w:lang w:eastAsia="ko-KR"/>
+        </w:rPr>
+        <w:t>주간/월간 단위의 감성 톤 변화를 시계열로 제공</w:t>
+      </w:r>
+    </w:p>
+    <w:p>
+      <w:pPr>
+        <w:pStyle w:val="Compact"/>
+        <w:numPr>
+          <w:ilvl w:val="0"/>
+          <w:numId w:val="9"/>
+        </w:numPr>
+        <w:rPr>
+          <w:rFonts w:asciiTheme="majorEastAsia" w:eastAsiaTheme="majorEastAsia" w:hAnsiTheme="majorEastAsia"/>
+          <w:color w:val="000000" w:themeColor="text1"/>
+          <w:sz w:val="22"/>
+          <w:szCs w:val="22"/>
+          <w:lang w:eastAsia="ko-KR"/>
+        </w:rPr>
+      </w:pPr>
+      <w:r>
+        <w:rPr>
+          <w:rFonts w:asciiTheme="majorEastAsia" w:eastAsiaTheme="majorEastAsia" w:hAnsiTheme="majorEastAsia"/>
+          <w:color w:val="000000" w:themeColor="text1"/>
+          <w:sz w:val="22"/>
+          <w:szCs w:val="22"/>
+          <w:lang w:eastAsia="ko-KR"/>
+        </w:rPr>
+        <w:t>분야(증권/산업/글로벌 등)별 비교 가능</w:t>
+      </w:r>
+      <w:bookmarkStart w:id="13" w:name="키워드-및-트렌드-분석"/>
+      <w:bookmarkEnd w:id="12"/>
+    </w:p>
+    <w:p>
+      <w:pPr>
+        <w:pStyle w:val="Compact"/>
+        <w:ind w:left="720"/>
+        <w:rPr>
+          <w:rFonts w:asciiTheme="majorEastAsia" w:eastAsiaTheme="majorEastAsia" w:hAnsiTheme="majorEastAsia"/>
+          <w:color w:val="000000" w:themeColor="text1"/>
+          <w:sz w:val="22"/>
+          <w:szCs w:val="22"/>
+          <w:lang w:eastAsia="ko-KR"/>
+        </w:rPr>
+      </w:pPr>
+    </w:p>
+    <w:p>
+      <w:pPr>
+        <w:pStyle w:val="2"/>
         <w:rPr>
           <w:rFonts w:asciiTheme="majorEastAsia" w:hAnsiTheme="majorEastAsia"/>
           <w:color w:val="000000" w:themeColor="text1"/>
           <w:sz w:val="24"/>
           <w:szCs w:val="24"/>
         </w:rPr>
-        <w:t xml:space="preserve"> </w:t>
-      </w:r>
-      <w:proofErr w:type="spellStart"/>
+      </w:pPr>
       <w:r>
         <w:rPr>
           <w:rFonts w:asciiTheme="majorEastAsia" w:hAnsiTheme="majorEastAsia"/>
@@ -1521,19 +1381,117 @@
           <w:sz w:val="24"/>
           <w:szCs w:val="24"/>
         </w:rPr>
-        <w:t>추이</w:t>
-      </w:r>
-      <w:proofErr w:type="spellEnd"/>
-      <w:r>
+        <w:t>키워드 및 트렌드 분석</w:t>
+      </w:r>
+    </w:p>
+    <w:p>
+      <w:pPr>
+        <w:pStyle w:val="Compact"/>
+        <w:numPr>
+          <w:ilvl w:val="0"/>
+          <w:numId w:val="10"/>
+        </w:numPr>
+        <w:rPr>
+          <w:rFonts w:asciiTheme="majorEastAsia" w:eastAsiaTheme="majorEastAsia" w:hAnsiTheme="majorEastAsia"/>
+          <w:color w:val="000000" w:themeColor="text1"/>
+          <w:sz w:val="22"/>
+          <w:szCs w:val="22"/>
+          <w:lang w:eastAsia="ko-KR"/>
+        </w:rPr>
+      </w:pPr>
+      <w:r>
+        <w:rPr>
+          <w:rFonts w:asciiTheme="majorEastAsia" w:eastAsiaTheme="majorEastAsia" w:hAnsiTheme="majorEastAsia"/>
+          <w:color w:val="000000" w:themeColor="text1"/>
+          <w:sz w:val="22"/>
+          <w:szCs w:val="22"/>
+          <w:lang w:eastAsia="ko-KR"/>
+        </w:rPr>
+        <w:t xml:space="preserve">뉴스+블로그 통합 분석으로 </w:t>
+      </w:r>
+      <w:r>
+        <w:rPr>
+          <w:rFonts w:asciiTheme="majorEastAsia" w:eastAsiaTheme="majorEastAsia" w:hAnsiTheme="majorEastAsia"/>
+          <w:b/>
+          <w:bCs/>
+          <w:color w:val="000000" w:themeColor="text1"/>
+          <w:sz w:val="22"/>
+          <w:szCs w:val="22"/>
+          <w:lang w:eastAsia="ko-KR"/>
+        </w:rPr>
+        <w:t>핫토픽</w:t>
+      </w:r>
+      <w:r>
+        <w:rPr>
+          <w:rFonts w:asciiTheme="majorEastAsia" w:eastAsiaTheme="majorEastAsia" w:hAnsiTheme="majorEastAsia"/>
+          <w:color w:val="000000" w:themeColor="text1"/>
+          <w:sz w:val="22"/>
+          <w:szCs w:val="22"/>
+          <w:lang w:eastAsia="ko-KR"/>
+        </w:rPr>
+        <w:t xml:space="preserve">과 </w:t>
+      </w:r>
+      <w:r>
+        <w:rPr>
+          <w:rFonts w:asciiTheme="majorEastAsia" w:eastAsiaTheme="majorEastAsia" w:hAnsiTheme="majorEastAsia"/>
+          <w:b/>
+          <w:bCs/>
+          <w:color w:val="000000" w:themeColor="text1"/>
+          <w:sz w:val="22"/>
+          <w:szCs w:val="22"/>
+          <w:lang w:eastAsia="ko-KR"/>
+        </w:rPr>
+        <w:t>급등 키워드</w:t>
+      </w:r>
+      <w:r>
+        <w:rPr>
+          <w:rFonts w:asciiTheme="majorEastAsia" w:eastAsiaTheme="majorEastAsia" w:hAnsiTheme="majorEastAsia"/>
+          <w:color w:val="000000" w:themeColor="text1"/>
+          <w:sz w:val="22"/>
+          <w:szCs w:val="22"/>
+          <w:lang w:eastAsia="ko-KR"/>
+        </w:rPr>
+        <w:t xml:space="preserve"> 탐지</w:t>
+      </w:r>
+    </w:p>
+    <w:p>
+      <w:pPr>
+        <w:pStyle w:val="Compact"/>
+        <w:numPr>
+          <w:ilvl w:val="0"/>
+          <w:numId w:val="10"/>
+        </w:numPr>
+        <w:rPr>
+          <w:rFonts w:asciiTheme="majorEastAsia" w:eastAsiaTheme="majorEastAsia" w:hAnsiTheme="majorEastAsia"/>
+          <w:color w:val="000000" w:themeColor="text1"/>
+          <w:sz w:val="22"/>
+          <w:szCs w:val="22"/>
+          <w:lang w:eastAsia="ko-KR"/>
+        </w:rPr>
+      </w:pPr>
+      <w:r>
+        <w:rPr>
+          <w:rFonts w:asciiTheme="majorEastAsia" w:eastAsiaTheme="majorEastAsia" w:hAnsiTheme="majorEastAsia"/>
+          <w:color w:val="000000" w:themeColor="text1"/>
+          <w:sz w:val="22"/>
+          <w:szCs w:val="22"/>
+          <w:lang w:eastAsia="ko-KR"/>
+        </w:rPr>
+        <w:t>시점별 키워드 변화 추적 및 상관지표 탐색</w:t>
+      </w:r>
+    </w:p>
+    <w:p>
+      <w:pPr>
+        <w:pStyle w:val="2"/>
         <w:rPr>
           <w:rFonts w:asciiTheme="majorEastAsia" w:hAnsiTheme="majorEastAsia"/>
           <w:color w:val="000000" w:themeColor="text1"/>
           <w:sz w:val="24"/>
           <w:szCs w:val="24"/>
         </w:rPr>
-        <w:t xml:space="preserve"> </w:t>
-      </w:r>
-      <w:proofErr w:type="spellStart"/>
+      </w:pPr>
+      <w:bookmarkStart w:id="14" w:name="기사-클러스터링"/>
+      <w:bookmarkEnd w:id="13"/>
       <w:r>
         <w:rPr>
           <w:rFonts w:asciiTheme="majorEastAsia" w:hAnsiTheme="majorEastAsia"/>
@@ -1541,76 +1499,86 @@
           <w:sz w:val="24"/>
           <w:szCs w:val="24"/>
         </w:rPr>
-        <w:t>시각화</w:t>
-      </w:r>
-      <w:proofErr w:type="spellEnd"/>
-    </w:p>
-    <w:p>
-      <w:pPr>
-        <w:pStyle w:val="Compact"/>
-        <w:numPr>
-          <w:ilvl w:val="0"/>
-          <w:numId w:val="9"/>
-        </w:numPr>
-        <w:rPr>
-          <w:rFonts w:asciiTheme="majorEastAsia" w:eastAsiaTheme="majorEastAsia" w:hAnsiTheme="majorEastAsia"/>
-          <w:color w:val="000000" w:themeColor="text1"/>
-          <w:sz w:val="22"/>
-          <w:szCs w:val="22"/>
-          <w:lang w:eastAsia="ko-KR"/>
-        </w:rPr>
-      </w:pPr>
-      <w:r>
-        <w:rPr>
-          <w:rFonts w:asciiTheme="majorEastAsia" w:eastAsiaTheme="majorEastAsia" w:hAnsiTheme="majorEastAsia"/>
-          <w:color w:val="000000" w:themeColor="text1"/>
-          <w:sz w:val="22"/>
-          <w:szCs w:val="22"/>
-          <w:lang w:eastAsia="ko-KR"/>
-        </w:rPr>
-        <w:t>주간/월간 단위의 감성 톤 변화를 시계열로 제공</w:t>
-      </w:r>
-    </w:p>
-    <w:p>
-      <w:pPr>
-        <w:pStyle w:val="Compact"/>
-        <w:numPr>
-          <w:ilvl w:val="0"/>
-          <w:numId w:val="9"/>
-        </w:numPr>
-        <w:rPr>
-          <w:rFonts w:asciiTheme="majorEastAsia" w:eastAsiaTheme="majorEastAsia" w:hAnsiTheme="majorEastAsia"/>
-          <w:color w:val="000000" w:themeColor="text1"/>
-          <w:sz w:val="22"/>
-          <w:szCs w:val="22"/>
-          <w:lang w:eastAsia="ko-KR"/>
-        </w:rPr>
-      </w:pPr>
-      <w:r>
-        <w:rPr>
-          <w:rFonts w:asciiTheme="majorEastAsia" w:eastAsiaTheme="majorEastAsia" w:hAnsiTheme="majorEastAsia"/>
-          <w:color w:val="000000" w:themeColor="text1"/>
-          <w:sz w:val="22"/>
-          <w:szCs w:val="22"/>
-          <w:lang w:eastAsia="ko-KR"/>
-        </w:rPr>
-        <w:t>분야(증권/산업/글로벌 등)별 비교 가능</w:t>
-      </w:r>
-      <w:bookmarkStart w:id="13" w:name="키워드-및-트렌드-분석"/>
-      <w:bookmarkEnd w:id="12"/>
-    </w:p>
-    <w:p>
-      <w:pPr>
-        <w:pStyle w:val="Compact"/>
-        <w:ind w:left="720"/>
-        <w:rPr>
-          <w:rFonts w:asciiTheme="majorEastAsia" w:eastAsiaTheme="majorEastAsia" w:hAnsiTheme="majorEastAsia"/>
-          <w:color w:val="000000" w:themeColor="text1"/>
-          <w:sz w:val="22"/>
-          <w:szCs w:val="22"/>
-          <w:lang w:eastAsia="ko-KR"/>
-        </w:rPr>
-      </w:pPr>
+        <w:t>기사 클러스터링</w:t>
+      </w:r>
+    </w:p>
+    <w:p>
+      <w:pPr>
+        <w:pStyle w:val="Compact"/>
+        <w:numPr>
+          <w:ilvl w:val="0"/>
+          <w:numId w:val="11"/>
+        </w:numPr>
+        <w:rPr>
+          <w:rFonts w:asciiTheme="majorEastAsia" w:eastAsiaTheme="majorEastAsia" w:hAnsiTheme="majorEastAsia"/>
+          <w:color w:val="000000" w:themeColor="text1"/>
+          <w:sz w:val="22"/>
+          <w:szCs w:val="22"/>
+          <w:lang w:eastAsia="ko-KR"/>
+        </w:rPr>
+      </w:pPr>
+      <w:r>
+        <w:rPr>
+          <w:rFonts w:asciiTheme="majorEastAsia" w:eastAsiaTheme="majorEastAsia" w:hAnsiTheme="majorEastAsia"/>
+          <w:color w:val="000000" w:themeColor="text1"/>
+          <w:sz w:val="22"/>
+          <w:szCs w:val="22"/>
+          <w:lang w:eastAsia="ko-KR"/>
+        </w:rPr>
+        <w:t>최근 30일 뉴스를 GPT가 자동 묶음화</w:t>
+      </w:r>
+    </w:p>
+    <w:p>
+      <w:pPr>
+        <w:pStyle w:val="Compact"/>
+        <w:numPr>
+          <w:ilvl w:val="0"/>
+          <w:numId w:val="11"/>
+        </w:numPr>
+        <w:rPr>
+          <w:rFonts w:asciiTheme="majorEastAsia" w:eastAsiaTheme="majorEastAsia" w:hAnsiTheme="majorEastAsia"/>
+          <w:color w:val="000000" w:themeColor="text1"/>
+          <w:sz w:val="22"/>
+          <w:szCs w:val="22"/>
+          <w:lang w:eastAsia="ko-KR"/>
+        </w:rPr>
+      </w:pPr>
+      <w:r>
+        <w:rPr>
+          <w:rFonts w:asciiTheme="majorEastAsia" w:eastAsiaTheme="majorEastAsia" w:hAnsiTheme="majorEastAsia"/>
+          <w:color w:val="000000" w:themeColor="text1"/>
+          <w:sz w:val="22"/>
+          <w:szCs w:val="22"/>
+          <w:lang w:eastAsia="ko-KR"/>
+        </w:rPr>
+        <w:t>“금리 인하”, “부동산 침체” 등 주제 라벨링</w:t>
+      </w:r>
+    </w:p>
+    <w:p>
+      <w:pPr>
+        <w:pStyle w:val="Compact"/>
+        <w:numPr>
+          <w:ilvl w:val="0"/>
+          <w:numId w:val="11"/>
+        </w:numPr>
+        <w:rPr>
+          <w:rFonts w:asciiTheme="majorEastAsia" w:eastAsiaTheme="majorEastAsia" w:hAnsiTheme="majorEastAsia"/>
+          <w:color w:val="000000" w:themeColor="text1"/>
+          <w:sz w:val="22"/>
+          <w:szCs w:val="22"/>
+          <w:lang w:eastAsia="ko-KR"/>
+        </w:rPr>
+      </w:pPr>
+      <w:r>
+        <w:rPr>
+          <w:rFonts w:asciiTheme="majorEastAsia" w:eastAsiaTheme="majorEastAsia" w:hAnsiTheme="majorEastAsia"/>
+          <w:color w:val="000000" w:themeColor="text1"/>
+          <w:sz w:val="22"/>
+          <w:szCs w:val="22"/>
+          <w:lang w:eastAsia="ko-KR"/>
+        </w:rPr>
+        <w:t>트리맵으로 클러스터 구조 시각화</w:t>
+      </w:r>
     </w:p>
     <w:p>
       <w:pPr>
@@ -1622,7 +1590,8 @@
           <w:szCs w:val="24"/>
         </w:rPr>
       </w:pPr>
-      <w:proofErr w:type="spellStart"/>
+      <w:bookmarkStart w:id="15" w:name="유튜브-오피니언-마이닝"/>
+      <w:bookmarkEnd w:id="14"/>
       <w:r>
         <w:rPr>
           <w:rFonts w:asciiTheme="majorEastAsia" w:hAnsiTheme="majorEastAsia"/>
@@ -1630,19 +1599,117 @@
           <w:sz w:val="24"/>
           <w:szCs w:val="24"/>
         </w:rPr>
-        <w:t>키워드</w:t>
-      </w:r>
-      <w:proofErr w:type="spellEnd"/>
-      <w:r>
+        <w:t>유튜브 오피니언 마이닝</w:t>
+      </w:r>
+    </w:p>
+    <w:p>
+      <w:pPr>
+        <w:pStyle w:val="Compact"/>
+        <w:numPr>
+          <w:ilvl w:val="0"/>
+          <w:numId w:val="12"/>
+        </w:numPr>
+        <w:rPr>
+          <w:rFonts w:asciiTheme="majorEastAsia" w:eastAsiaTheme="majorEastAsia" w:hAnsiTheme="majorEastAsia"/>
+          <w:color w:val="000000" w:themeColor="text1"/>
+          <w:sz w:val="22"/>
+          <w:szCs w:val="22"/>
+          <w:lang w:eastAsia="ko-KR"/>
+        </w:rPr>
+      </w:pPr>
+      <w:r>
+        <w:rPr>
+          <w:rFonts w:asciiTheme="majorEastAsia" w:eastAsiaTheme="majorEastAsia" w:hAnsiTheme="majorEastAsia"/>
+          <w:color w:val="000000" w:themeColor="text1"/>
+          <w:sz w:val="22"/>
+          <w:szCs w:val="22"/>
+          <w:lang w:eastAsia="ko-KR"/>
+        </w:rPr>
+        <w:t xml:space="preserve">댓글 기반 </w:t>
+      </w:r>
+      <w:r>
+        <w:rPr>
+          <w:rFonts w:asciiTheme="majorEastAsia" w:eastAsiaTheme="majorEastAsia" w:hAnsiTheme="majorEastAsia"/>
+          <w:b/>
+          <w:bCs/>
+          <w:color w:val="000000" w:themeColor="text1"/>
+          <w:sz w:val="22"/>
+          <w:szCs w:val="22"/>
+          <w:lang w:eastAsia="ko-KR"/>
+        </w:rPr>
+        <w:t>긍/부정 비율</w:t>
+      </w:r>
+      <w:r>
+        <w:rPr>
+          <w:rFonts w:asciiTheme="majorEastAsia" w:eastAsiaTheme="majorEastAsia" w:hAnsiTheme="majorEastAsia"/>
+          <w:color w:val="000000" w:themeColor="text1"/>
+          <w:sz w:val="22"/>
+          <w:szCs w:val="22"/>
+          <w:lang w:eastAsia="ko-KR"/>
+        </w:rPr>
+        <w:t xml:space="preserve"> 및 </w:t>
+      </w:r>
+      <w:r>
+        <w:rPr>
+          <w:rFonts w:asciiTheme="majorEastAsia" w:eastAsiaTheme="majorEastAsia" w:hAnsiTheme="majorEastAsia"/>
+          <w:b/>
+          <w:bCs/>
+          <w:color w:val="000000" w:themeColor="text1"/>
+          <w:sz w:val="22"/>
+          <w:szCs w:val="22"/>
+          <w:lang w:eastAsia="ko-KR"/>
+        </w:rPr>
+        <w:t>핵심 단어</w:t>
+      </w:r>
+      <w:r>
+        <w:rPr>
+          <w:rFonts w:asciiTheme="majorEastAsia" w:eastAsiaTheme="majorEastAsia" w:hAnsiTheme="majorEastAsia"/>
+          <w:color w:val="000000" w:themeColor="text1"/>
+          <w:sz w:val="22"/>
+          <w:szCs w:val="22"/>
+          <w:lang w:eastAsia="ko-KR"/>
+        </w:rPr>
+        <w:t xml:space="preserve"> 추출</w:t>
+      </w:r>
+    </w:p>
+    <w:p>
+      <w:pPr>
+        <w:pStyle w:val="Compact"/>
+        <w:numPr>
+          <w:ilvl w:val="0"/>
+          <w:numId w:val="12"/>
+        </w:numPr>
+        <w:rPr>
+          <w:rFonts w:asciiTheme="majorEastAsia" w:eastAsiaTheme="majorEastAsia" w:hAnsiTheme="majorEastAsia"/>
+          <w:color w:val="000000" w:themeColor="text1"/>
+          <w:sz w:val="22"/>
+          <w:szCs w:val="22"/>
+          <w:lang w:eastAsia="ko-KR"/>
+        </w:rPr>
+      </w:pPr>
+      <w:r>
+        <w:rPr>
+          <w:rFonts w:asciiTheme="majorEastAsia" w:eastAsiaTheme="majorEastAsia" w:hAnsiTheme="majorEastAsia"/>
+          <w:color w:val="000000" w:themeColor="text1"/>
+          <w:sz w:val="22"/>
+          <w:szCs w:val="22"/>
+          <w:lang w:eastAsia="ko-KR"/>
+        </w:rPr>
+        <w:t>워드클라우드/파이차트로 직관적 요약</w:t>
+      </w:r>
+    </w:p>
+    <w:p>
+      <w:pPr>
+        <w:pStyle w:val="2"/>
         <w:rPr>
           <w:rFonts w:asciiTheme="majorEastAsia" w:hAnsiTheme="majorEastAsia"/>
           <w:color w:val="000000" w:themeColor="text1"/>
           <w:sz w:val="24"/>
           <w:szCs w:val="24"/>
         </w:rPr>
-        <w:t xml:space="preserve"> 및 </w:t>
-      </w:r>
-      <w:proofErr w:type="spellStart"/>
+      </w:pPr>
+      <w:bookmarkStart w:id="16" w:name="맞춤형-추천"/>
+      <w:bookmarkEnd w:id="15"/>
       <w:r>
         <w:rPr>
           <w:rFonts w:asciiTheme="majorEastAsia" w:hAnsiTheme="majorEastAsia"/>
@@ -1650,526 +1717,9 @@
           <w:sz w:val="24"/>
           <w:szCs w:val="24"/>
         </w:rPr>
-        <w:t>트렌드</w:t>
-      </w:r>
-      <w:proofErr w:type="spellEnd"/>
-      <w:r>
-        <w:rPr>
-          <w:rFonts w:asciiTheme="majorEastAsia" w:hAnsiTheme="majorEastAsia"/>
-          <w:color w:val="000000" w:themeColor="text1"/>
-          <w:sz w:val="24"/>
-          <w:szCs w:val="24"/>
-        </w:rPr>
-        <w:t xml:space="preserve"> </w:t>
-      </w:r>
-      <w:proofErr w:type="spellStart"/>
-      <w:r>
-        <w:rPr>
-          <w:rFonts w:asciiTheme="majorEastAsia" w:hAnsiTheme="majorEastAsia"/>
-          <w:color w:val="000000" w:themeColor="text1"/>
-          <w:sz w:val="24"/>
-          <w:szCs w:val="24"/>
-        </w:rPr>
-        <w:t>분석</w:t>
-      </w:r>
-      <w:proofErr w:type="spellEnd"/>
-    </w:p>
-    <w:p>
-      <w:pPr>
-        <w:pStyle w:val="Compact"/>
-        <w:numPr>
-          <w:ilvl w:val="0"/>
-          <w:numId w:val="10"/>
-        </w:numPr>
-        <w:rPr>
-          <w:rFonts w:asciiTheme="majorEastAsia" w:eastAsiaTheme="majorEastAsia" w:hAnsiTheme="majorEastAsia"/>
-          <w:color w:val="000000" w:themeColor="text1"/>
-          <w:sz w:val="22"/>
-          <w:szCs w:val="22"/>
-          <w:lang w:eastAsia="ko-KR"/>
-        </w:rPr>
-      </w:pPr>
-      <w:r>
-        <w:rPr>
-          <w:rFonts w:asciiTheme="majorEastAsia" w:eastAsiaTheme="majorEastAsia" w:hAnsiTheme="majorEastAsia"/>
-          <w:color w:val="000000" w:themeColor="text1"/>
-          <w:sz w:val="22"/>
-          <w:szCs w:val="22"/>
-          <w:lang w:eastAsia="ko-KR"/>
-        </w:rPr>
-        <w:t xml:space="preserve">뉴스+블로그 통합 분석으로 </w:t>
-      </w:r>
-      <w:proofErr w:type="spellStart"/>
-      <w:r>
-        <w:rPr>
-          <w:rFonts w:asciiTheme="majorEastAsia" w:eastAsiaTheme="majorEastAsia" w:hAnsiTheme="majorEastAsia"/>
-          <w:b/>
-          <w:bCs/>
-          <w:color w:val="000000" w:themeColor="text1"/>
-          <w:sz w:val="22"/>
-          <w:szCs w:val="22"/>
-          <w:lang w:eastAsia="ko-KR"/>
-        </w:rPr>
-        <w:t>핫토픽</w:t>
-      </w:r>
-      <w:r>
-        <w:rPr>
-          <w:rFonts w:asciiTheme="majorEastAsia" w:eastAsiaTheme="majorEastAsia" w:hAnsiTheme="majorEastAsia"/>
-          <w:color w:val="000000" w:themeColor="text1"/>
-          <w:sz w:val="22"/>
-          <w:szCs w:val="22"/>
-          <w:lang w:eastAsia="ko-KR"/>
-        </w:rPr>
-        <w:t>과</w:t>
-      </w:r>
-      <w:proofErr w:type="spellEnd"/>
-      <w:r>
-        <w:rPr>
-          <w:rFonts w:asciiTheme="majorEastAsia" w:eastAsiaTheme="majorEastAsia" w:hAnsiTheme="majorEastAsia"/>
-          <w:color w:val="000000" w:themeColor="text1"/>
-          <w:sz w:val="22"/>
-          <w:szCs w:val="22"/>
-          <w:lang w:eastAsia="ko-KR"/>
-        </w:rPr>
-        <w:t xml:space="preserve"> </w:t>
-      </w:r>
-      <w:r>
-        <w:rPr>
-          <w:rFonts w:asciiTheme="majorEastAsia" w:eastAsiaTheme="majorEastAsia" w:hAnsiTheme="majorEastAsia"/>
-          <w:b/>
-          <w:bCs/>
-          <w:color w:val="000000" w:themeColor="text1"/>
-          <w:sz w:val="22"/>
-          <w:szCs w:val="22"/>
-          <w:lang w:eastAsia="ko-KR"/>
-        </w:rPr>
-        <w:t>급등 키워드</w:t>
-      </w:r>
-      <w:r>
-        <w:rPr>
-          <w:rFonts w:asciiTheme="majorEastAsia" w:eastAsiaTheme="majorEastAsia" w:hAnsiTheme="majorEastAsia"/>
-          <w:color w:val="000000" w:themeColor="text1"/>
-          <w:sz w:val="22"/>
-          <w:szCs w:val="22"/>
-          <w:lang w:eastAsia="ko-KR"/>
-        </w:rPr>
-        <w:t xml:space="preserve"> 탐지</w:t>
-      </w:r>
-    </w:p>
-    <w:p>
-      <w:pPr>
-        <w:pStyle w:val="Compact"/>
-        <w:numPr>
-          <w:ilvl w:val="0"/>
-          <w:numId w:val="10"/>
-        </w:numPr>
-        <w:rPr>
-          <w:rFonts w:asciiTheme="majorEastAsia" w:eastAsiaTheme="majorEastAsia" w:hAnsiTheme="majorEastAsia"/>
-          <w:color w:val="000000" w:themeColor="text1"/>
-          <w:sz w:val="22"/>
-          <w:szCs w:val="22"/>
-          <w:lang w:eastAsia="ko-KR"/>
-        </w:rPr>
-      </w:pPr>
-      <w:r>
-        <w:rPr>
-          <w:rFonts w:asciiTheme="majorEastAsia" w:eastAsiaTheme="majorEastAsia" w:hAnsiTheme="majorEastAsia"/>
-          <w:color w:val="000000" w:themeColor="text1"/>
-          <w:sz w:val="22"/>
-          <w:szCs w:val="22"/>
-          <w:lang w:eastAsia="ko-KR"/>
-        </w:rPr>
-        <w:t>시점별 키워드 변화 추적 및 상관지표 탐색</w:t>
-      </w:r>
-    </w:p>
-    <w:p>
-      <w:pPr>
-        <w:pStyle w:val="2"/>
-        <w:rPr>
-          <w:rFonts w:asciiTheme="majorEastAsia" w:hAnsiTheme="majorEastAsia"/>
-          <w:color w:val="000000" w:themeColor="text1"/>
-          <w:sz w:val="24"/>
-          <w:szCs w:val="24"/>
-        </w:rPr>
-      </w:pPr>
-      <w:bookmarkStart w:id="14" w:name="기사-클러스터링"/>
-      <w:bookmarkEnd w:id="13"/>
-      <w:proofErr w:type="spellStart"/>
-      <w:r>
-        <w:rPr>
-          <w:rFonts w:asciiTheme="majorEastAsia" w:hAnsiTheme="majorEastAsia"/>
-          <w:color w:val="000000" w:themeColor="text1"/>
-          <w:sz w:val="24"/>
-          <w:szCs w:val="24"/>
-        </w:rPr>
-        <w:t>기사</w:t>
-      </w:r>
-      <w:proofErr w:type="spellEnd"/>
-      <w:r>
-        <w:rPr>
-          <w:rFonts w:asciiTheme="majorEastAsia" w:hAnsiTheme="majorEastAsia"/>
-          <w:color w:val="000000" w:themeColor="text1"/>
-          <w:sz w:val="24"/>
-          <w:szCs w:val="24"/>
-        </w:rPr>
-        <w:t xml:space="preserve"> </w:t>
-      </w:r>
-      <w:proofErr w:type="spellStart"/>
-      <w:r>
-        <w:rPr>
-          <w:rFonts w:asciiTheme="majorEastAsia" w:hAnsiTheme="majorEastAsia"/>
-          <w:color w:val="000000" w:themeColor="text1"/>
-          <w:sz w:val="24"/>
-          <w:szCs w:val="24"/>
-        </w:rPr>
-        <w:t>클러스터링</w:t>
-      </w:r>
-      <w:proofErr w:type="spellEnd"/>
-    </w:p>
-    <w:p>
-      <w:pPr>
-        <w:pStyle w:val="Compact"/>
-        <w:numPr>
-          <w:ilvl w:val="0"/>
-          <w:numId w:val="11"/>
-        </w:numPr>
-        <w:rPr>
-          <w:rFonts w:asciiTheme="majorEastAsia" w:eastAsiaTheme="majorEastAsia" w:hAnsiTheme="majorEastAsia"/>
-          <w:color w:val="000000" w:themeColor="text1"/>
-          <w:sz w:val="22"/>
-          <w:szCs w:val="22"/>
-          <w:lang w:eastAsia="ko-KR"/>
-        </w:rPr>
-      </w:pPr>
-      <w:r>
-        <w:rPr>
-          <w:rFonts w:asciiTheme="majorEastAsia" w:eastAsiaTheme="majorEastAsia" w:hAnsiTheme="majorEastAsia"/>
-          <w:color w:val="000000" w:themeColor="text1"/>
-          <w:sz w:val="22"/>
-          <w:szCs w:val="22"/>
-          <w:lang w:eastAsia="ko-KR"/>
-        </w:rPr>
-        <w:t xml:space="preserve">최근 30일 뉴스를 GPT가 자동 </w:t>
-      </w:r>
-      <w:proofErr w:type="spellStart"/>
-      <w:r>
-        <w:rPr>
-          <w:rFonts w:asciiTheme="majorEastAsia" w:eastAsiaTheme="majorEastAsia" w:hAnsiTheme="majorEastAsia"/>
-          <w:color w:val="000000" w:themeColor="text1"/>
-          <w:sz w:val="22"/>
-          <w:szCs w:val="22"/>
-          <w:lang w:eastAsia="ko-KR"/>
-        </w:rPr>
-        <w:t>묶음화</w:t>
-      </w:r>
-      <w:proofErr w:type="spellEnd"/>
-    </w:p>
-    <w:p>
-      <w:pPr>
-        <w:pStyle w:val="Compact"/>
-        <w:numPr>
-          <w:ilvl w:val="0"/>
-          <w:numId w:val="11"/>
-        </w:numPr>
-        <w:rPr>
-          <w:rFonts w:asciiTheme="majorEastAsia" w:eastAsiaTheme="majorEastAsia" w:hAnsiTheme="majorEastAsia"/>
-          <w:color w:val="000000" w:themeColor="text1"/>
-          <w:sz w:val="22"/>
-          <w:szCs w:val="22"/>
-          <w:lang w:eastAsia="ko-KR"/>
-        </w:rPr>
-      </w:pPr>
-      <w:r>
-        <w:rPr>
-          <w:rFonts w:asciiTheme="majorEastAsia" w:eastAsiaTheme="majorEastAsia" w:hAnsiTheme="majorEastAsia"/>
-          <w:color w:val="000000" w:themeColor="text1"/>
-          <w:sz w:val="22"/>
-          <w:szCs w:val="22"/>
-          <w:lang w:eastAsia="ko-KR"/>
-        </w:rPr>
-        <w:t xml:space="preserve">“금리 인하”, “부동산 침체” 등 주제 </w:t>
-      </w:r>
-      <w:proofErr w:type="spellStart"/>
-      <w:r>
-        <w:rPr>
-          <w:rFonts w:asciiTheme="majorEastAsia" w:eastAsiaTheme="majorEastAsia" w:hAnsiTheme="majorEastAsia"/>
-          <w:color w:val="000000" w:themeColor="text1"/>
-          <w:sz w:val="22"/>
-          <w:szCs w:val="22"/>
-          <w:lang w:eastAsia="ko-KR"/>
-        </w:rPr>
-        <w:t>라벨링</w:t>
-      </w:r>
-      <w:proofErr w:type="spellEnd"/>
-    </w:p>
-    <w:p>
-      <w:pPr>
-        <w:pStyle w:val="Compact"/>
-        <w:numPr>
-          <w:ilvl w:val="0"/>
-          <w:numId w:val="11"/>
-        </w:numPr>
-        <w:rPr>
-          <w:rFonts w:asciiTheme="majorEastAsia" w:eastAsiaTheme="majorEastAsia" w:hAnsiTheme="majorEastAsia"/>
-          <w:color w:val="000000" w:themeColor="text1"/>
-          <w:sz w:val="22"/>
-          <w:szCs w:val="22"/>
-          <w:lang w:eastAsia="ko-KR"/>
-        </w:rPr>
-      </w:pPr>
-      <w:proofErr w:type="spellStart"/>
-      <w:r>
-        <w:rPr>
-          <w:rFonts w:asciiTheme="majorEastAsia" w:eastAsiaTheme="majorEastAsia" w:hAnsiTheme="majorEastAsia"/>
-          <w:color w:val="000000" w:themeColor="text1"/>
-          <w:sz w:val="22"/>
-          <w:szCs w:val="22"/>
-          <w:lang w:eastAsia="ko-KR"/>
-        </w:rPr>
-        <w:t>트리맵으로</w:t>
-      </w:r>
-      <w:proofErr w:type="spellEnd"/>
-      <w:r>
-        <w:rPr>
-          <w:rFonts w:asciiTheme="majorEastAsia" w:eastAsiaTheme="majorEastAsia" w:hAnsiTheme="majorEastAsia"/>
-          <w:color w:val="000000" w:themeColor="text1"/>
-          <w:sz w:val="22"/>
-          <w:szCs w:val="22"/>
-          <w:lang w:eastAsia="ko-KR"/>
-        </w:rPr>
-        <w:t xml:space="preserve"> 클러스터 구조 시각화</w:t>
-      </w:r>
-    </w:p>
-    <w:p>
-      <w:pPr>
-        <w:pStyle w:val="2"/>
-        <w:rPr>
-          <w:rFonts w:asciiTheme="majorEastAsia" w:hAnsiTheme="majorEastAsia"/>
-          <w:color w:val="000000" w:themeColor="text1"/>
-          <w:sz w:val="24"/>
-          <w:szCs w:val="24"/>
-        </w:rPr>
-      </w:pPr>
-      <w:bookmarkStart w:id="15" w:name="유튜브-오피니언-마이닝"/>
-      <w:bookmarkEnd w:id="14"/>
-      <w:proofErr w:type="spellStart"/>
-      <w:r>
-        <w:rPr>
-          <w:rFonts w:asciiTheme="majorEastAsia" w:hAnsiTheme="majorEastAsia"/>
-          <w:color w:val="000000" w:themeColor="text1"/>
-          <w:sz w:val="24"/>
-          <w:szCs w:val="24"/>
-        </w:rPr>
-        <w:t>유튜브</w:t>
-      </w:r>
-      <w:proofErr w:type="spellEnd"/>
-      <w:r>
-        <w:rPr>
-          <w:rFonts w:asciiTheme="majorEastAsia" w:hAnsiTheme="majorEastAsia"/>
-          <w:color w:val="000000" w:themeColor="text1"/>
-          <w:sz w:val="24"/>
-          <w:szCs w:val="24"/>
-        </w:rPr>
-        <w:t xml:space="preserve"> </w:t>
-      </w:r>
-      <w:proofErr w:type="spellStart"/>
-      <w:r>
-        <w:rPr>
-          <w:rFonts w:asciiTheme="majorEastAsia" w:hAnsiTheme="majorEastAsia"/>
-          <w:color w:val="000000" w:themeColor="text1"/>
-          <w:sz w:val="24"/>
-          <w:szCs w:val="24"/>
-        </w:rPr>
-        <w:t>오피니언</w:t>
-      </w:r>
-      <w:proofErr w:type="spellEnd"/>
-      <w:r>
-        <w:rPr>
-          <w:rFonts w:asciiTheme="majorEastAsia" w:hAnsiTheme="majorEastAsia"/>
-          <w:color w:val="000000" w:themeColor="text1"/>
-          <w:sz w:val="24"/>
-          <w:szCs w:val="24"/>
-        </w:rPr>
-        <w:t xml:space="preserve"> </w:t>
-      </w:r>
-      <w:proofErr w:type="spellStart"/>
-      <w:r>
-        <w:rPr>
-          <w:rFonts w:asciiTheme="majorEastAsia" w:hAnsiTheme="majorEastAsia"/>
-          <w:color w:val="000000" w:themeColor="text1"/>
-          <w:sz w:val="24"/>
-          <w:szCs w:val="24"/>
-        </w:rPr>
-        <w:t>마이닝</w:t>
-      </w:r>
-      <w:proofErr w:type="spellEnd"/>
-    </w:p>
-    <w:p>
-      <w:pPr>
-        <w:pStyle w:val="Compact"/>
-        <w:numPr>
-          <w:ilvl w:val="0"/>
-          <w:numId w:val="12"/>
-        </w:numPr>
-        <w:rPr>
-          <w:rFonts w:asciiTheme="majorEastAsia" w:eastAsiaTheme="majorEastAsia" w:hAnsiTheme="majorEastAsia"/>
-          <w:color w:val="000000" w:themeColor="text1"/>
-          <w:sz w:val="22"/>
-          <w:szCs w:val="22"/>
-          <w:lang w:eastAsia="ko-KR"/>
-        </w:rPr>
-      </w:pPr>
-      <w:r>
-        <w:rPr>
-          <w:rFonts w:asciiTheme="majorEastAsia" w:eastAsiaTheme="majorEastAsia" w:hAnsiTheme="majorEastAsia"/>
-          <w:color w:val="000000" w:themeColor="text1"/>
-          <w:sz w:val="22"/>
-          <w:szCs w:val="22"/>
-          <w:lang w:eastAsia="ko-KR"/>
-        </w:rPr>
-        <w:t xml:space="preserve">댓글 기반 </w:t>
-      </w:r>
-      <w:proofErr w:type="spellStart"/>
-      <w:r>
-        <w:rPr>
-          <w:rFonts w:asciiTheme="majorEastAsia" w:eastAsiaTheme="majorEastAsia" w:hAnsiTheme="majorEastAsia"/>
-          <w:b/>
-          <w:bCs/>
-          <w:color w:val="000000" w:themeColor="text1"/>
-          <w:sz w:val="22"/>
-          <w:szCs w:val="22"/>
-          <w:lang w:eastAsia="ko-KR"/>
-        </w:rPr>
-        <w:t>긍</w:t>
-      </w:r>
-      <w:proofErr w:type="spellEnd"/>
-      <w:r>
-        <w:rPr>
-          <w:rFonts w:asciiTheme="majorEastAsia" w:eastAsiaTheme="majorEastAsia" w:hAnsiTheme="majorEastAsia"/>
-          <w:b/>
-          <w:bCs/>
-          <w:color w:val="000000" w:themeColor="text1"/>
-          <w:sz w:val="22"/>
-          <w:szCs w:val="22"/>
-          <w:lang w:eastAsia="ko-KR"/>
-        </w:rPr>
-        <w:t>/부정 비율</w:t>
-      </w:r>
-      <w:r>
-        <w:rPr>
-          <w:rFonts w:asciiTheme="majorEastAsia" w:eastAsiaTheme="majorEastAsia" w:hAnsiTheme="majorEastAsia"/>
-          <w:color w:val="000000" w:themeColor="text1"/>
-          <w:sz w:val="22"/>
-          <w:szCs w:val="22"/>
-          <w:lang w:eastAsia="ko-KR"/>
-        </w:rPr>
-        <w:t xml:space="preserve"> 및 </w:t>
-      </w:r>
-      <w:r>
-        <w:rPr>
-          <w:rFonts w:asciiTheme="majorEastAsia" w:eastAsiaTheme="majorEastAsia" w:hAnsiTheme="majorEastAsia"/>
-          <w:b/>
-          <w:bCs/>
-          <w:color w:val="000000" w:themeColor="text1"/>
-          <w:sz w:val="22"/>
-          <w:szCs w:val="22"/>
-          <w:lang w:eastAsia="ko-KR"/>
-        </w:rPr>
-        <w:t>핵심 단어</w:t>
-      </w:r>
-      <w:r>
-        <w:rPr>
-          <w:rFonts w:asciiTheme="majorEastAsia" w:eastAsiaTheme="majorEastAsia" w:hAnsiTheme="majorEastAsia"/>
-          <w:color w:val="000000" w:themeColor="text1"/>
-          <w:sz w:val="22"/>
-          <w:szCs w:val="22"/>
-          <w:lang w:eastAsia="ko-KR"/>
-        </w:rPr>
-        <w:t xml:space="preserve"> 추출</w:t>
-      </w:r>
-    </w:p>
-    <w:p>
-      <w:pPr>
-        <w:pStyle w:val="Compact"/>
-        <w:numPr>
-          <w:ilvl w:val="0"/>
-          <w:numId w:val="12"/>
-        </w:numPr>
-        <w:rPr>
-          <w:rFonts w:asciiTheme="majorEastAsia" w:eastAsiaTheme="majorEastAsia" w:hAnsiTheme="majorEastAsia"/>
-          <w:color w:val="000000" w:themeColor="text1"/>
-          <w:sz w:val="22"/>
-          <w:szCs w:val="22"/>
-          <w:lang w:eastAsia="ko-KR"/>
-        </w:rPr>
-      </w:pPr>
-      <w:proofErr w:type="spellStart"/>
-      <w:r>
-        <w:rPr>
-          <w:rFonts w:asciiTheme="majorEastAsia" w:eastAsiaTheme="majorEastAsia" w:hAnsiTheme="majorEastAsia"/>
-          <w:color w:val="000000" w:themeColor="text1"/>
-          <w:sz w:val="22"/>
-          <w:szCs w:val="22"/>
-          <w:lang w:eastAsia="ko-KR"/>
-        </w:rPr>
-        <w:t>워드클라우드</w:t>
-      </w:r>
-      <w:proofErr w:type="spellEnd"/>
-      <w:r>
-        <w:rPr>
-          <w:rFonts w:asciiTheme="majorEastAsia" w:eastAsiaTheme="majorEastAsia" w:hAnsiTheme="majorEastAsia"/>
-          <w:color w:val="000000" w:themeColor="text1"/>
-          <w:sz w:val="22"/>
-          <w:szCs w:val="22"/>
-          <w:lang w:eastAsia="ko-KR"/>
-        </w:rPr>
-        <w:t>/파이차트로 직관적 요약</w:t>
-      </w:r>
-    </w:p>
-    <w:p>
-      <w:pPr>
-        <w:pStyle w:val="2"/>
-        <w:rPr>
-          <w:rFonts w:asciiTheme="majorEastAsia" w:hAnsiTheme="majorEastAsia"/>
-          <w:color w:val="000000" w:themeColor="text1"/>
-          <w:sz w:val="24"/>
-          <w:szCs w:val="24"/>
-        </w:rPr>
-      </w:pPr>
-      <w:bookmarkStart w:id="16" w:name="맞춤형-추천"/>
-      <w:bookmarkEnd w:id="15"/>
-      <w:proofErr w:type="spellStart"/>
-      <w:r>
-        <w:rPr>
-          <w:rFonts w:asciiTheme="majorEastAsia" w:hAnsiTheme="majorEastAsia"/>
-          <w:color w:val="000000" w:themeColor="text1"/>
-          <w:sz w:val="24"/>
-          <w:szCs w:val="24"/>
-        </w:rPr>
         <w:lastRenderedPageBreak/>
-        <w:t>맞춤형</w:t>
-      </w:r>
-      <w:proofErr w:type="spellEnd"/>
-      <w:r>
-        <w:rPr>
-          <w:rFonts w:asciiTheme="majorEastAsia" w:hAnsiTheme="majorEastAsia"/>
-          <w:color w:val="000000" w:themeColor="text1"/>
-          <w:sz w:val="24"/>
-          <w:szCs w:val="24"/>
-        </w:rPr>
-        <w:t xml:space="preserve"> </w:t>
-      </w:r>
-      <w:proofErr w:type="spellStart"/>
-      <w:r>
-        <w:rPr>
-          <w:rFonts w:asciiTheme="majorEastAsia" w:hAnsiTheme="majorEastAsia"/>
-          <w:color w:val="000000" w:themeColor="text1"/>
-          <w:sz w:val="24"/>
-          <w:szCs w:val="24"/>
-        </w:rPr>
-        <w:t>추천</w:t>
-      </w:r>
-      <w:proofErr w:type="spellEnd"/>
+        <w:t>맞춤형 추천</w:t>
+      </w:r>
     </w:p>
     <w:p>
       <w:pPr>
@@ -2194,29 +1744,7 @@
           <w:szCs w:val="22"/>
           <w:lang w:eastAsia="ko-KR"/>
         </w:rPr>
-        <w:t>관심 분야(글로벌/시장/기업 등)</w:t>
-      </w:r>
-      <w:proofErr w:type="spellStart"/>
-      <w:r>
-        <w:rPr>
-          <w:rFonts w:asciiTheme="majorEastAsia" w:eastAsiaTheme="majorEastAsia" w:hAnsiTheme="majorEastAsia"/>
-          <w:color w:val="000000" w:themeColor="text1"/>
-          <w:sz w:val="22"/>
-          <w:szCs w:val="22"/>
-          <w:lang w:eastAsia="ko-KR"/>
-        </w:rPr>
-        <w:t>에</w:t>
-      </w:r>
-      <w:proofErr w:type="spellEnd"/>
-      <w:r>
-        <w:rPr>
-          <w:rFonts w:asciiTheme="majorEastAsia" w:eastAsiaTheme="majorEastAsia" w:hAnsiTheme="majorEastAsia"/>
-          <w:color w:val="000000" w:themeColor="text1"/>
-          <w:sz w:val="22"/>
-          <w:szCs w:val="22"/>
-          <w:lang w:eastAsia="ko-KR"/>
-        </w:rPr>
-        <w:t xml:space="preserve"> 맞춰 </w:t>
+        <w:t xml:space="preserve">관심 분야(글로벌/시장/기업 등)에 맞춰 </w:t>
       </w:r>
       <w:r>
         <w:rPr>
@@ -2255,25 +1783,14 @@
           <w:szCs w:val="22"/>
         </w:rPr>
       </w:pPr>
-      <w:proofErr w:type="spellStart"/>
-      <w:r>
-        <w:rPr>
-          <w:rFonts w:asciiTheme="majorEastAsia" w:eastAsiaTheme="majorEastAsia" w:hAnsiTheme="majorEastAsia"/>
-          <w:color w:val="000000" w:themeColor="text1"/>
-          <w:sz w:val="22"/>
-          <w:szCs w:val="22"/>
-        </w:rPr>
-        <w:t>알라딘</w:t>
-      </w:r>
-      <w:proofErr w:type="spellEnd"/>
-      <w:r>
-        <w:rPr>
-          <w:rFonts w:asciiTheme="majorEastAsia" w:eastAsiaTheme="majorEastAsia" w:hAnsiTheme="majorEastAsia"/>
-          <w:color w:val="000000" w:themeColor="text1"/>
-          <w:sz w:val="22"/>
-          <w:szCs w:val="22"/>
-        </w:rPr>
-        <w:t xml:space="preserve"> API, YouTube API 활용</w:t>
+      <w:r>
+        <w:rPr>
+          <w:rFonts w:asciiTheme="majorEastAsia" w:eastAsiaTheme="majorEastAsia" w:hAnsiTheme="majorEastAsia"/>
+          <w:color w:val="000000" w:themeColor="text1"/>
+          <w:sz w:val="22"/>
+          <w:szCs w:val="22"/>
+        </w:rPr>
+        <w:t>알라딘 API, YouTube API 활용</w:t>
       </w:r>
     </w:p>
     <w:p>
@@ -2320,41 +1837,17 @@
           <w:szCs w:val="22"/>
           <w:lang w:eastAsia="ko-KR"/>
         </w:rPr>
-        <w:t xml:space="preserve">RAG 기반 </w:t>
-      </w:r>
-      <w:proofErr w:type="spellStart"/>
-      <w:r>
-        <w:rPr>
-          <w:rFonts w:asciiTheme="majorEastAsia" w:eastAsiaTheme="majorEastAsia" w:hAnsiTheme="majorEastAsia"/>
-          <w:b/>
-          <w:bCs/>
-          <w:color w:val="000000" w:themeColor="text1"/>
-          <w:sz w:val="22"/>
-          <w:szCs w:val="22"/>
-          <w:lang w:eastAsia="ko-KR"/>
-        </w:rPr>
-        <w:t>챗봇</w:t>
-      </w:r>
-      <w:r>
-        <w:rPr>
-          <w:rFonts w:asciiTheme="majorEastAsia" w:eastAsiaTheme="majorEastAsia" w:hAnsiTheme="majorEastAsia"/>
-          <w:color w:val="000000" w:themeColor="text1"/>
-          <w:sz w:val="22"/>
-          <w:szCs w:val="22"/>
-          <w:lang w:eastAsia="ko-KR"/>
-        </w:rPr>
-        <w:t>은</w:t>
-      </w:r>
-      <w:proofErr w:type="spellEnd"/>
-      <w:r>
-        <w:rPr>
-          <w:rFonts w:asciiTheme="majorEastAsia" w:eastAsiaTheme="majorEastAsia" w:hAnsiTheme="majorEastAsia"/>
-          <w:color w:val="000000" w:themeColor="text1"/>
-          <w:sz w:val="22"/>
-          <w:szCs w:val="22"/>
-          <w:lang w:eastAsia="ko-KR"/>
-        </w:rPr>
-        <w:t xml:space="preserve"> 뉴스 데이터와 GPT</w:t>
+        <w:t>RAG 기반 챗봇</w:t>
+      </w:r>
+      <w:r>
+        <w:rPr>
+          <w:rFonts w:asciiTheme="majorEastAsia" w:eastAsiaTheme="majorEastAsia" w:hAnsiTheme="majorEastAsia"/>
+          <w:color w:val="000000" w:themeColor="text1"/>
+          <w:sz w:val="22"/>
+          <w:szCs w:val="22"/>
+          <w:lang w:eastAsia="ko-KR"/>
+        </w:rPr>
+        <w:t>은 뉴스 데이터와 GPT</w:t>
       </w:r>
       <w:r>
         <w:rPr>
@@ -2388,37 +1881,15 @@
         </w:rPr>
       </w:pPr>
       <w:bookmarkStart w:id="18" w:name="핵심-기능"/>
-      <w:proofErr w:type="spellStart"/>
-      <w:r>
-        <w:rPr>
-          <w:rFonts w:asciiTheme="majorEastAsia" w:hAnsiTheme="majorEastAsia"/>
-          <w:color w:val="000000" w:themeColor="text1"/>
-          <w:sz w:val="22"/>
-          <w:szCs w:val="22"/>
-        </w:rPr>
-        <w:t>핵심</w:t>
-      </w:r>
-      <w:proofErr w:type="spellEnd"/>
-      <w:r>
-        <w:rPr>
-          <w:rFonts w:asciiTheme="majorEastAsia" w:hAnsiTheme="majorEastAsia"/>
-          <w:color w:val="000000" w:themeColor="text1"/>
-          <w:sz w:val="22"/>
-          <w:szCs w:val="22"/>
-        </w:rPr>
-        <w:t xml:space="preserve"> </w:t>
-      </w:r>
-      <w:proofErr w:type="spellStart"/>
-      <w:r>
-        <w:rPr>
-          <w:rFonts w:asciiTheme="majorEastAsia" w:hAnsiTheme="majorEastAsia"/>
-          <w:color w:val="000000" w:themeColor="text1"/>
-          <w:sz w:val="22"/>
-          <w:szCs w:val="22"/>
-        </w:rPr>
-        <w:t>기능</w:t>
-      </w:r>
-      <w:proofErr w:type="spellEnd"/>
+      <w:r>
+        <w:rPr>
+          <w:rFonts w:asciiTheme="majorEastAsia" w:hAnsiTheme="majorEastAsia"/>
+          <w:color w:val="000000" w:themeColor="text1"/>
+          <w:sz w:val="22"/>
+          <w:szCs w:val="22"/>
+        </w:rPr>
+        <w:t>핵심 기능</w:t>
+      </w:r>
     </w:p>
     <w:p>
       <w:pPr>
@@ -2528,79 +1999,8 @@
           <w:sz w:val="22"/>
           <w:szCs w:val="22"/>
         </w:rPr>
-        <w:t xml:space="preserve">: CLOVA Speech </w:t>
-      </w:r>
-      <w:proofErr w:type="spellStart"/>
-      <w:r>
-        <w:rPr>
-          <w:rFonts w:asciiTheme="majorEastAsia" w:eastAsiaTheme="majorEastAsia" w:hAnsiTheme="majorEastAsia"/>
-          <w:color w:val="000000" w:themeColor="text1"/>
-          <w:sz w:val="22"/>
-          <w:szCs w:val="22"/>
-        </w:rPr>
-        <w:t>Recognition으로</w:t>
-      </w:r>
-      <w:proofErr w:type="spellEnd"/>
-      <w:r>
-        <w:rPr>
-          <w:rFonts w:asciiTheme="majorEastAsia" w:eastAsiaTheme="majorEastAsia" w:hAnsiTheme="majorEastAsia"/>
-          <w:color w:val="000000" w:themeColor="text1"/>
-          <w:sz w:val="22"/>
-          <w:szCs w:val="22"/>
-        </w:rPr>
-        <w:t xml:space="preserve"> </w:t>
-      </w:r>
-      <w:proofErr w:type="spellStart"/>
-      <w:r>
-        <w:rPr>
-          <w:rFonts w:asciiTheme="majorEastAsia" w:eastAsiaTheme="majorEastAsia" w:hAnsiTheme="majorEastAsia"/>
-          <w:color w:val="000000" w:themeColor="text1"/>
-          <w:sz w:val="22"/>
-          <w:szCs w:val="22"/>
-        </w:rPr>
-        <w:t>음성</w:t>
-      </w:r>
-      <w:proofErr w:type="spellEnd"/>
-      <w:r>
-        <w:rPr>
-          <w:rFonts w:asciiTheme="majorEastAsia" w:eastAsiaTheme="majorEastAsia" w:hAnsiTheme="majorEastAsia"/>
-          <w:color w:val="000000" w:themeColor="text1"/>
-          <w:sz w:val="22"/>
-          <w:szCs w:val="22"/>
-        </w:rPr>
-        <w:t xml:space="preserve"> </w:t>
-      </w:r>
-      <w:proofErr w:type="spellStart"/>
-      <w:r>
-        <w:rPr>
-          <w:rFonts w:asciiTheme="majorEastAsia" w:eastAsiaTheme="majorEastAsia" w:hAnsiTheme="majorEastAsia"/>
-          <w:color w:val="000000" w:themeColor="text1"/>
-          <w:sz w:val="22"/>
-          <w:szCs w:val="22"/>
-        </w:rPr>
-        <w:t>입력</w:t>
-      </w:r>
-      <w:proofErr w:type="spellEnd"/>
-      <w:r>
-        <w:rPr>
-          <w:rFonts w:asciiTheme="majorEastAsia" w:eastAsiaTheme="majorEastAsia" w:hAnsiTheme="majorEastAsia"/>
-          <w:color w:val="000000" w:themeColor="text1"/>
-          <w:sz w:val="22"/>
-          <w:szCs w:val="22"/>
-        </w:rPr>
-        <w:t xml:space="preserve"> </w:t>
-      </w:r>
-      <w:proofErr w:type="spellStart"/>
-      <w:r>
-        <w:rPr>
-          <w:rFonts w:asciiTheme="majorEastAsia" w:eastAsiaTheme="majorEastAsia" w:hAnsiTheme="majorEastAsia"/>
-          <w:color w:val="000000" w:themeColor="text1"/>
-          <w:sz w:val="22"/>
-          <w:szCs w:val="22"/>
-        </w:rPr>
-        <w:t>인식</w:t>
-      </w:r>
-      <w:proofErr w:type="spellEnd"/>
+        <w:t>: CLOVA Speech Recognition으로 음성 입력 인식</w:t>
+      </w:r>
     </w:p>
     <w:p>
       <w:pPr>
@@ -2672,29 +2072,7 @@
           <w:szCs w:val="22"/>
           <w:lang w:eastAsia="ko-KR"/>
         </w:rPr>
-        <w:t>: “</w:t>
-      </w:r>
-      <w:proofErr w:type="spellStart"/>
-      <w:r>
-        <w:rPr>
-          <w:rFonts w:asciiTheme="majorEastAsia" w:eastAsiaTheme="majorEastAsia" w:hAnsiTheme="majorEastAsia"/>
-          <w:color w:val="000000" w:themeColor="text1"/>
-          <w:sz w:val="22"/>
-          <w:szCs w:val="22"/>
-          <w:lang w:eastAsia="ko-KR"/>
-        </w:rPr>
-        <w:t>핫토픽은</w:t>
-      </w:r>
-      <w:proofErr w:type="spellEnd"/>
-      <w:r>
-        <w:rPr>
-          <w:rFonts w:asciiTheme="majorEastAsia" w:eastAsiaTheme="majorEastAsia" w:hAnsiTheme="majorEastAsia"/>
-          <w:color w:val="000000" w:themeColor="text1"/>
-          <w:sz w:val="22"/>
-          <w:szCs w:val="22"/>
-          <w:lang w:eastAsia="ko-KR"/>
-        </w:rPr>
-        <w:t xml:space="preserve"> 어디서 보나요?” 등 사이트 기능 안내</w:t>
+        <w:t>: “핫토픽은 어디서 보나요?” 등 사이트 기능 안내</w:t>
       </w:r>
     </w:p>
     <w:p>
@@ -2709,37 +2087,15 @@
       </w:pPr>
       <w:bookmarkStart w:id="19" w:name="활용-예시"/>
       <w:bookmarkEnd w:id="18"/>
-      <w:proofErr w:type="spellStart"/>
-      <w:r>
-        <w:rPr>
-          <w:rFonts w:asciiTheme="majorEastAsia" w:hAnsiTheme="majorEastAsia"/>
-          <w:color w:val="000000" w:themeColor="text1"/>
-          <w:sz w:val="22"/>
-          <w:szCs w:val="22"/>
-        </w:rPr>
-        <w:t>활용</w:t>
-      </w:r>
-      <w:proofErr w:type="spellEnd"/>
-      <w:r>
-        <w:rPr>
-          <w:rFonts w:asciiTheme="majorEastAsia" w:hAnsiTheme="majorEastAsia"/>
-          <w:color w:val="000000" w:themeColor="text1"/>
-          <w:sz w:val="22"/>
-          <w:szCs w:val="22"/>
-        </w:rPr>
-        <w:t xml:space="preserve"> </w:t>
-      </w:r>
-      <w:proofErr w:type="spellStart"/>
-      <w:r>
-        <w:rPr>
-          <w:rFonts w:asciiTheme="majorEastAsia" w:hAnsiTheme="majorEastAsia"/>
-          <w:color w:val="000000" w:themeColor="text1"/>
-          <w:sz w:val="22"/>
-          <w:szCs w:val="22"/>
-        </w:rPr>
-        <w:t>예시</w:t>
-      </w:r>
-      <w:proofErr w:type="spellEnd"/>
+      <w:r>
+        <w:rPr>
+          <w:rFonts w:asciiTheme="majorEastAsia" w:hAnsiTheme="majorEastAsia"/>
+          <w:color w:val="000000" w:themeColor="text1"/>
+          <w:sz w:val="22"/>
+          <w:szCs w:val="22"/>
+        </w:rPr>
+        <w:t>활용 예시</w:t>
+      </w:r>
     </w:p>
     <w:p>
       <w:pPr>
@@ -2812,29 +2168,7 @@
           <w:szCs w:val="22"/>
           <w:lang w:eastAsia="ko-KR"/>
         </w:rPr>
-        <w:t xml:space="preserve">“금리 인하가 </w:t>
-      </w:r>
-      <w:proofErr w:type="spellStart"/>
-      <w:r>
-        <w:rPr>
-          <w:rFonts w:asciiTheme="majorEastAsia" w:eastAsiaTheme="majorEastAsia" w:hAnsiTheme="majorEastAsia"/>
-          <w:color w:val="000000" w:themeColor="text1"/>
-          <w:sz w:val="22"/>
-          <w:szCs w:val="22"/>
-          <w:lang w:eastAsia="ko-KR"/>
-        </w:rPr>
-        <w:t>뭐야</w:t>
-      </w:r>
-      <w:proofErr w:type="spellEnd"/>
-      <w:r>
-        <w:rPr>
-          <w:rFonts w:asciiTheme="majorEastAsia" w:eastAsiaTheme="majorEastAsia" w:hAnsiTheme="majorEastAsia"/>
-          <w:color w:val="000000" w:themeColor="text1"/>
-          <w:sz w:val="22"/>
-          <w:szCs w:val="22"/>
-          <w:lang w:eastAsia="ko-KR"/>
-        </w:rPr>
-        <w:t xml:space="preserve">?” → </w:t>
+        <w:t xml:space="preserve">“금리 인하가 뭐야?” → </w:t>
       </w:r>
       <w:r>
         <w:rPr>
@@ -2935,7 +2269,6 @@
         </w:rPr>
       </w:pPr>
       <w:bookmarkStart w:id="22" w:name="대시보드"/>
-      <w:proofErr w:type="spellStart"/>
       <w:r>
         <w:rPr>
           <w:rFonts w:asciiTheme="majorEastAsia" w:hAnsiTheme="majorEastAsia"/>
@@ -2945,7 +2278,6 @@
         </w:rPr>
         <w:t>대시보드</w:t>
       </w:r>
-      <w:proofErr w:type="spellEnd"/>
     </w:p>
     <w:p>
       <w:pPr>
@@ -2994,29 +2326,7 @@
           <w:szCs w:val="22"/>
           <w:lang w:eastAsia="ko-KR"/>
         </w:rPr>
-        <w:t xml:space="preserve">키워드 </w:t>
-      </w:r>
-      <w:proofErr w:type="spellStart"/>
-      <w:r>
-        <w:rPr>
-          <w:rFonts w:asciiTheme="majorEastAsia" w:eastAsiaTheme="majorEastAsia" w:hAnsiTheme="majorEastAsia"/>
-          <w:color w:val="000000" w:themeColor="text1"/>
-          <w:sz w:val="22"/>
-          <w:szCs w:val="22"/>
-          <w:lang w:eastAsia="ko-KR"/>
-        </w:rPr>
-        <w:t>핫토픽</w:t>
-      </w:r>
-      <w:proofErr w:type="spellEnd"/>
-      <w:r>
-        <w:rPr>
-          <w:rFonts w:asciiTheme="majorEastAsia" w:eastAsiaTheme="majorEastAsia" w:hAnsiTheme="majorEastAsia"/>
-          <w:color w:val="000000" w:themeColor="text1"/>
-          <w:sz w:val="22"/>
-          <w:szCs w:val="22"/>
-          <w:lang w:eastAsia="ko-KR"/>
-        </w:rPr>
-        <w:t xml:space="preserve"> </w:t>
+        <w:t xml:space="preserve">키워드 핫토픽 </w:t>
       </w:r>
       <w:r>
         <w:rPr>
@@ -3056,31 +2366,17 @@
         </w:rPr>
         <w:t xml:space="preserve">오늘의 감성 요약, </w:t>
       </w:r>
-      <w:proofErr w:type="spellStart"/>
-      <w:r>
-        <w:rPr>
-          <w:rFonts w:asciiTheme="majorEastAsia" w:eastAsiaTheme="majorEastAsia" w:hAnsiTheme="majorEastAsia"/>
-          <w:b/>
-          <w:bCs/>
-          <w:color w:val="000000" w:themeColor="text1"/>
-          <w:sz w:val="22"/>
-          <w:szCs w:val="22"/>
-          <w:lang w:eastAsia="ko-KR"/>
-        </w:rPr>
-        <w:t>긍</w:t>
-      </w:r>
-      <w:proofErr w:type="spellEnd"/>
-      <w:r>
-        <w:rPr>
-          <w:rFonts w:asciiTheme="majorEastAsia" w:eastAsiaTheme="majorEastAsia" w:hAnsiTheme="majorEastAsia"/>
-          <w:b/>
-          <w:bCs/>
-          <w:color w:val="000000" w:themeColor="text1"/>
-          <w:sz w:val="22"/>
-          <w:szCs w:val="22"/>
-          <w:lang w:eastAsia="ko-KR"/>
-        </w:rPr>
-        <w:t>·부정 추이</w:t>
+      <w:r>
+        <w:rPr>
+          <w:rFonts w:asciiTheme="majorEastAsia" w:eastAsiaTheme="majorEastAsia" w:hAnsiTheme="majorEastAsia"/>
+          <w:b/>
+          <w:bCs/>
+          <w:color w:val="000000" w:themeColor="text1"/>
+          <w:sz w:val="22"/>
+          <w:szCs w:val="22"/>
+          <w:lang w:eastAsia="ko-KR"/>
+        </w:rPr>
+        <w:t>긍·부정 추이</w:t>
       </w:r>
     </w:p>
     <w:p>
@@ -3135,57 +2431,15 @@
           <w:szCs w:val="22"/>
         </w:rPr>
       </w:pPr>
-      <w:proofErr w:type="spellStart"/>
-      <w:r>
-        <w:rPr>
-          <w:rFonts w:asciiTheme="majorEastAsia" w:eastAsiaTheme="majorEastAsia" w:hAnsiTheme="majorEastAsia"/>
-          <w:color w:val="000000" w:themeColor="text1"/>
-          <w:sz w:val="22"/>
-          <w:szCs w:val="22"/>
-        </w:rPr>
-        <w:t>오피니언</w:t>
-      </w:r>
-      <w:proofErr w:type="spellEnd"/>
-      <w:r>
-        <w:rPr>
-          <w:rFonts w:asciiTheme="majorEastAsia" w:eastAsiaTheme="majorEastAsia" w:hAnsiTheme="majorEastAsia"/>
-          <w:color w:val="000000" w:themeColor="text1"/>
-          <w:sz w:val="22"/>
-          <w:szCs w:val="22"/>
-        </w:rPr>
-        <w:t xml:space="preserve"> </w:t>
-      </w:r>
-      <w:proofErr w:type="spellStart"/>
-      <w:r>
-        <w:rPr>
-          <w:rFonts w:asciiTheme="majorEastAsia" w:eastAsiaTheme="majorEastAsia" w:hAnsiTheme="majorEastAsia"/>
-          <w:color w:val="000000" w:themeColor="text1"/>
-          <w:sz w:val="22"/>
-          <w:szCs w:val="22"/>
-        </w:rPr>
-        <w:t>마이닝</w:t>
-      </w:r>
-      <w:proofErr w:type="spellEnd"/>
-      <w:r>
-        <w:rPr>
-          <w:rFonts w:asciiTheme="majorEastAsia" w:eastAsiaTheme="majorEastAsia" w:hAnsiTheme="majorEastAsia"/>
-          <w:color w:val="000000" w:themeColor="text1"/>
-          <w:sz w:val="22"/>
-          <w:szCs w:val="22"/>
-        </w:rPr>
-        <w:t xml:space="preserve"> </w:t>
-      </w:r>
-      <w:proofErr w:type="spellStart"/>
-      <w:r>
-        <w:rPr>
-          <w:rFonts w:asciiTheme="majorEastAsia" w:eastAsiaTheme="majorEastAsia" w:hAnsiTheme="majorEastAsia"/>
-          <w:color w:val="000000" w:themeColor="text1"/>
-          <w:sz w:val="22"/>
-          <w:szCs w:val="22"/>
-        </w:rPr>
-        <w:t>요약</w:t>
-      </w:r>
-      <w:proofErr w:type="spellEnd"/>
+      <w:r>
+        <w:rPr>
+          <w:rFonts w:asciiTheme="majorEastAsia" w:eastAsiaTheme="majorEastAsia" w:hAnsiTheme="majorEastAsia"/>
+          <w:color w:val="000000" w:themeColor="text1"/>
+          <w:sz w:val="22"/>
+          <w:szCs w:val="22"/>
+        </w:rPr>
+        <w:t>오피니언 마이닝 요약</w:t>
+      </w:r>
     </w:p>
     <w:p>
       <w:pPr>
@@ -3241,7 +2495,7 @@
           <w:numId w:val="18"/>
         </w:numPr>
         <w:rPr>
-          <w:rFonts w:asciiTheme="majorEastAsia" w:eastAsiaTheme="majorEastAsia" w:hAnsiTheme="majorEastAsia" w:hint="eastAsia"/>
+          <w:rFonts w:asciiTheme="majorEastAsia" w:eastAsiaTheme="majorEastAsia" w:hAnsiTheme="majorEastAsia"/>
           <w:color w:val="000000" w:themeColor="text1"/>
           <w:sz w:val="22"/>
           <w:szCs w:val="22"/>
@@ -3308,35 +2562,22 @@
           <w:szCs w:val="22"/>
           <w:lang w:eastAsia="ko-KR"/>
         </w:rPr>
-        <w:t xml:space="preserve">유튜브 댓글 감성 및 </w:t>
-      </w:r>
-      <w:proofErr w:type="spellStart"/>
-      <w:r>
-        <w:rPr>
-          <w:rFonts w:asciiTheme="majorEastAsia" w:hAnsiTheme="majorEastAsia"/>
-          <w:color w:val="000000" w:themeColor="text1"/>
-          <w:sz w:val="22"/>
-          <w:szCs w:val="22"/>
-          <w:lang w:eastAsia="ko-KR"/>
-        </w:rPr>
-        <w:t>워드클라우드</w:t>
+        <w:t>유튜브 댓글 감성 및 워드클라우드</w:t>
       </w:r>
       <w:bookmarkStart w:id="25" w:name="챗봇"/>
       <w:bookmarkEnd w:id="24"/>
-      <w:proofErr w:type="spellEnd"/>
-    </w:p>
-    <w:p>
-      <w:pPr>
-        <w:pStyle w:val="Compact"/>
-        <w:rPr>
-          <w:rFonts w:asciiTheme="majorEastAsia" w:hAnsiTheme="majorEastAsia"/>
-          <w:color w:val="000000" w:themeColor="text1"/>
-          <w:sz w:val="22"/>
-          <w:szCs w:val="22"/>
-          <w:lang w:eastAsia="ko-KR"/>
-        </w:rPr>
-      </w:pPr>
-      <w:proofErr w:type="spellStart"/>
+    </w:p>
+    <w:p>
+      <w:pPr>
+        <w:pStyle w:val="Compact"/>
+        <w:rPr>
+          <w:rFonts w:asciiTheme="majorEastAsia" w:hAnsiTheme="majorEastAsia"/>
+          <w:color w:val="000000" w:themeColor="text1"/>
+          <w:sz w:val="22"/>
+          <w:szCs w:val="22"/>
+          <w:lang w:eastAsia="ko-KR"/>
+        </w:rPr>
+      </w:pPr>
       <w:r>
         <w:rPr>
           <w:rFonts w:asciiTheme="majorEastAsia" w:hAnsiTheme="majorEastAsia"/>
@@ -3347,7 +2588,6 @@
         </w:rPr>
         <w:t>챗봇</w:t>
       </w:r>
-      <w:proofErr w:type="spellEnd"/>
       <w:r>
         <w:rPr>
           <w:rFonts w:asciiTheme="majorEastAsia" w:hAnsiTheme="majorEastAsia" w:hint="eastAsia"/>
@@ -3518,29 +2758,7 @@
           <w:szCs w:val="22"/>
           <w:lang w:eastAsia="ko-KR"/>
         </w:rPr>
-        <w:t xml:space="preserve">: 사용자 입력(텍스트/음성) → Spring Boot → </w:t>
-      </w:r>
-      <w:proofErr w:type="spellStart"/>
-      <w:r>
-        <w:rPr>
-          <w:rFonts w:asciiTheme="majorEastAsia" w:eastAsiaTheme="majorEastAsia" w:hAnsiTheme="majorEastAsia"/>
-          <w:color w:val="000000" w:themeColor="text1"/>
-          <w:sz w:val="22"/>
-          <w:szCs w:val="22"/>
-          <w:lang w:eastAsia="ko-KR"/>
-        </w:rPr>
-        <w:t>FastAPI</w:t>
-      </w:r>
-      <w:proofErr w:type="spellEnd"/>
-      <w:r>
-        <w:rPr>
-          <w:rFonts w:asciiTheme="majorEastAsia" w:eastAsiaTheme="majorEastAsia" w:hAnsiTheme="majorEastAsia"/>
-          <w:color w:val="000000" w:themeColor="text1"/>
-          <w:sz w:val="22"/>
-          <w:szCs w:val="22"/>
-          <w:lang w:eastAsia="ko-KR"/>
-        </w:rPr>
-        <w:t xml:space="preserve"> → RAG 검색+생성 → 텍스트/음성 응답</w:t>
+        <w:t>: 사용자 입력(텍스트/음성) → Spring Boot → FastAPI → RAG 검색+생성 → 텍스트/음성 응답</w:t>
       </w:r>
     </w:p>
     <w:p>
@@ -3562,59 +2780,8 @@
           <w:sz w:val="28"/>
           <w:szCs w:val="28"/>
         </w:rPr>
-        <w:t xml:space="preserve">9. </w:t>
-      </w:r>
-      <w:proofErr w:type="spellStart"/>
-      <w:r>
-        <w:rPr>
-          <w:rFonts w:asciiTheme="majorEastAsia" w:hAnsiTheme="majorEastAsia"/>
-          <w:color w:val="000000" w:themeColor="text1"/>
-          <w:sz w:val="28"/>
-          <w:szCs w:val="28"/>
-        </w:rPr>
-        <w:t>일정</w:t>
-      </w:r>
-      <w:proofErr w:type="spellEnd"/>
-      <w:r>
-        <w:rPr>
-          <w:rFonts w:asciiTheme="majorEastAsia" w:hAnsiTheme="majorEastAsia"/>
-          <w:color w:val="000000" w:themeColor="text1"/>
-          <w:sz w:val="28"/>
-          <w:szCs w:val="28"/>
-        </w:rPr>
-        <w:t xml:space="preserve"> 및 </w:t>
-      </w:r>
-      <w:proofErr w:type="spellStart"/>
-      <w:r>
-        <w:rPr>
-          <w:rFonts w:asciiTheme="majorEastAsia" w:hAnsiTheme="majorEastAsia"/>
-          <w:color w:val="000000" w:themeColor="text1"/>
-          <w:sz w:val="28"/>
-          <w:szCs w:val="28"/>
-        </w:rPr>
-        <w:t>역할</w:t>
-      </w:r>
-      <w:proofErr w:type="spellEnd"/>
-      <w:r>
-        <w:rPr>
-          <w:rFonts w:asciiTheme="majorEastAsia" w:hAnsiTheme="majorEastAsia"/>
-          <w:color w:val="000000" w:themeColor="text1"/>
-          <w:sz w:val="28"/>
-          <w:szCs w:val="28"/>
-        </w:rPr>
-        <w:t xml:space="preserve"> </w:t>
-      </w:r>
-      <w:proofErr w:type="spellStart"/>
-      <w:r>
-        <w:rPr>
-          <w:rFonts w:asciiTheme="majorEastAsia" w:hAnsiTheme="majorEastAsia"/>
-          <w:color w:val="000000" w:themeColor="text1"/>
-          <w:sz w:val="28"/>
-          <w:szCs w:val="28"/>
-        </w:rPr>
-        <w:t>분담</w:t>
-      </w:r>
-      <w:proofErr w:type="spellEnd"/>
+        <w:t>9. 일정 및 역할 분담</w:t>
+      </w:r>
     </w:p>
     <w:p>
       <w:pPr>
@@ -3745,59 +2912,8 @@
           <w:sz w:val="22"/>
           <w:szCs w:val="22"/>
         </w:rPr>
-        <w:t xml:space="preserve">: </w:t>
-      </w:r>
-      <w:proofErr w:type="spellStart"/>
-      <w:r>
-        <w:rPr>
-          <w:rFonts w:asciiTheme="majorEastAsia" w:eastAsiaTheme="majorEastAsia" w:hAnsiTheme="majorEastAsia"/>
-          <w:color w:val="000000" w:themeColor="text1"/>
-          <w:sz w:val="22"/>
-          <w:szCs w:val="22"/>
-        </w:rPr>
-        <w:t>발표자료</w:t>
-      </w:r>
-      <w:proofErr w:type="spellEnd"/>
-      <w:r>
-        <w:rPr>
-          <w:rFonts w:asciiTheme="majorEastAsia" w:eastAsiaTheme="majorEastAsia" w:hAnsiTheme="majorEastAsia"/>
-          <w:color w:val="000000" w:themeColor="text1"/>
-          <w:sz w:val="22"/>
-          <w:szCs w:val="22"/>
-        </w:rPr>
-        <w:t xml:space="preserve"> </w:t>
-      </w:r>
-      <w:proofErr w:type="spellStart"/>
-      <w:r>
-        <w:rPr>
-          <w:rFonts w:asciiTheme="majorEastAsia" w:eastAsiaTheme="majorEastAsia" w:hAnsiTheme="majorEastAsia"/>
-          <w:color w:val="000000" w:themeColor="text1"/>
-          <w:sz w:val="22"/>
-          <w:szCs w:val="22"/>
-        </w:rPr>
-        <w:t>제작</w:t>
-      </w:r>
-      <w:proofErr w:type="spellEnd"/>
-      <w:r>
-        <w:rPr>
-          <w:rFonts w:asciiTheme="majorEastAsia" w:eastAsiaTheme="majorEastAsia" w:hAnsiTheme="majorEastAsia"/>
-          <w:color w:val="000000" w:themeColor="text1"/>
-          <w:sz w:val="22"/>
-          <w:szCs w:val="22"/>
-        </w:rPr>
-        <w:t xml:space="preserve"> 및 </w:t>
-      </w:r>
-      <w:proofErr w:type="spellStart"/>
-      <w:r>
-        <w:rPr>
-          <w:rFonts w:asciiTheme="majorEastAsia" w:eastAsiaTheme="majorEastAsia" w:hAnsiTheme="majorEastAsia"/>
-          <w:color w:val="000000" w:themeColor="text1"/>
-          <w:sz w:val="22"/>
-          <w:szCs w:val="22"/>
-        </w:rPr>
-        <w:t>리허설</w:t>
-      </w:r>
-      <w:proofErr w:type="spellEnd"/>
+        <w:t>: 발표자료 제작 및 리허설</w:t>
+      </w:r>
     </w:p>
     <w:p>
       <w:pPr>
@@ -3853,19 +2969,8 @@
           <w:sz w:val="24"/>
           <w:szCs w:val="24"/>
         </w:rPr>
-        <w:t xml:space="preserve">팀 </w:t>
-      </w:r>
-      <w:proofErr w:type="spellStart"/>
-      <w:r>
-        <w:rPr>
-          <w:rFonts w:asciiTheme="majorEastAsia" w:hAnsiTheme="majorEastAsia"/>
-          <w:color w:val="000000" w:themeColor="text1"/>
-          <w:sz w:val="24"/>
-          <w:szCs w:val="24"/>
-        </w:rPr>
-        <w:t>구성</w:t>
-      </w:r>
-      <w:proofErr w:type="spellEnd"/>
+        <w:t>팀 구성</w:t>
+      </w:r>
     </w:p>
     <w:p>
       <w:pPr>
@@ -3902,64 +3007,8 @@
           <w:szCs w:val="22"/>
           <w:lang w:eastAsia="ko-KR"/>
         </w:rPr>
-        <w:t xml:space="preserve">: 키워드 </w:t>
-      </w:r>
-      <w:proofErr w:type="spellStart"/>
-      <w:r>
-        <w:rPr>
-          <w:rFonts w:asciiTheme="majorEastAsia" w:eastAsiaTheme="majorEastAsia" w:hAnsiTheme="majorEastAsia"/>
-          <w:color w:val="000000" w:themeColor="text1"/>
-          <w:sz w:val="22"/>
-          <w:szCs w:val="22"/>
-          <w:lang w:eastAsia="ko-KR"/>
-        </w:rPr>
-        <w:t>핫토픽</w:t>
-      </w:r>
-      <w:proofErr w:type="spellEnd"/>
-      <w:r>
-        <w:rPr>
-          <w:rFonts w:asciiTheme="majorEastAsia" w:eastAsiaTheme="majorEastAsia" w:hAnsiTheme="majorEastAsia"/>
-          <w:color w:val="000000" w:themeColor="text1"/>
-          <w:sz w:val="22"/>
-          <w:szCs w:val="22"/>
-          <w:lang w:eastAsia="ko-KR"/>
-        </w:rPr>
-        <w:t xml:space="preserve">, </w:t>
-      </w:r>
-      <w:proofErr w:type="spellStart"/>
-      <w:r>
-        <w:rPr>
-          <w:rFonts w:asciiTheme="majorEastAsia" w:eastAsiaTheme="majorEastAsia" w:hAnsiTheme="majorEastAsia"/>
-          <w:color w:val="000000" w:themeColor="text1"/>
-          <w:sz w:val="22"/>
-          <w:szCs w:val="22"/>
-          <w:lang w:eastAsia="ko-KR"/>
-        </w:rPr>
-        <w:t>긍</w:t>
-      </w:r>
-      <w:proofErr w:type="spellEnd"/>
-      <w:r>
-        <w:rPr>
-          <w:rFonts w:asciiTheme="majorEastAsia" w:eastAsiaTheme="majorEastAsia" w:hAnsiTheme="majorEastAsia"/>
-          <w:color w:val="000000" w:themeColor="text1"/>
-          <w:sz w:val="22"/>
-          <w:szCs w:val="22"/>
-          <w:lang w:eastAsia="ko-KR"/>
-        </w:rPr>
-        <w:t xml:space="preserve">·부정 추이, </w:t>
-      </w:r>
-      <w:proofErr w:type="spellStart"/>
-      <w:r>
-        <w:rPr>
-          <w:rFonts w:asciiTheme="majorEastAsia" w:eastAsiaTheme="majorEastAsia" w:hAnsiTheme="majorEastAsia"/>
-          <w:color w:val="000000" w:themeColor="text1"/>
-          <w:sz w:val="22"/>
-          <w:szCs w:val="22"/>
-          <w:lang w:eastAsia="ko-KR"/>
-        </w:rPr>
-        <w:t>챗봇</w:t>
-      </w:r>
-      <w:proofErr w:type="spellEnd"/>
+        <w:t>: 키워드 핫토픽, 긍·부정 추이, 챗봇</w:t>
+      </w:r>
     </w:p>
     <w:p>
       <w:pPr>
@@ -3996,51 +3045,7 @@
           <w:szCs w:val="22"/>
           <w:lang w:eastAsia="ko-KR"/>
         </w:rPr>
-        <w:t xml:space="preserve">: </w:t>
-      </w:r>
-      <w:proofErr w:type="spellStart"/>
-      <w:r>
-        <w:rPr>
-          <w:rFonts w:asciiTheme="majorEastAsia" w:eastAsiaTheme="majorEastAsia" w:hAnsiTheme="majorEastAsia"/>
-          <w:color w:val="000000" w:themeColor="text1"/>
-          <w:sz w:val="22"/>
-          <w:szCs w:val="22"/>
-          <w:lang w:eastAsia="ko-KR"/>
-        </w:rPr>
-        <w:t>백엔드,</w:t>
-      </w:r>
-      <w:proofErr w:type="spellEnd"/>
-      <w:r>
-        <w:rPr>
-          <w:rFonts w:asciiTheme="majorEastAsia" w:eastAsiaTheme="majorEastAsia" w:hAnsiTheme="majorEastAsia"/>
-          <w:color w:val="000000" w:themeColor="text1"/>
-          <w:sz w:val="22"/>
-          <w:szCs w:val="22"/>
-          <w:lang w:eastAsia="ko-KR"/>
-        </w:rPr>
-        <w:t xml:space="preserve"> </w:t>
-      </w:r>
-      <w:proofErr w:type="spellStart"/>
-      <w:r>
-        <w:rPr>
-          <w:rFonts w:asciiTheme="majorEastAsia" w:eastAsiaTheme="majorEastAsia" w:hAnsiTheme="majorEastAsia"/>
-          <w:color w:val="000000" w:themeColor="text1"/>
-          <w:sz w:val="22"/>
-          <w:szCs w:val="22"/>
-          <w:lang w:eastAsia="ko-KR"/>
-        </w:rPr>
-        <w:t>핫토픽</w:t>
-      </w:r>
-      <w:proofErr w:type="spellEnd"/>
-      <w:r>
-        <w:rPr>
-          <w:rFonts w:asciiTheme="majorEastAsia" w:eastAsiaTheme="majorEastAsia" w:hAnsiTheme="majorEastAsia"/>
-          <w:color w:val="000000" w:themeColor="text1"/>
-          <w:sz w:val="22"/>
-          <w:szCs w:val="22"/>
-          <w:lang w:eastAsia="ko-KR"/>
-        </w:rPr>
-        <w:t xml:space="preserve"> 그래프, 키워드 랭킹, 추천, 로그인</w:t>
+        <w:t>: 백엔드, 핫토픽 그래프, 키워드 랭킹, 추천, 로그인</w:t>
       </w:r>
     </w:p>
     <w:p>
@@ -4058,7 +3063,6 @@
           <w:lang w:eastAsia="ko-KR"/>
         </w:rPr>
       </w:pPr>
-      <w:proofErr w:type="spellStart"/>
       <w:r>
         <w:rPr>
           <w:rFonts w:asciiTheme="majorEastAsia" w:eastAsiaTheme="majorEastAsia" w:hAnsiTheme="majorEastAsia"/>
@@ -4071,38 +3075,15 @@
         </w:rPr>
         <w:t>윤유정</w:t>
       </w:r>
-      <w:proofErr w:type="spellEnd"/>
-      <w:r>
-        <w:rPr>
-          <w:rFonts w:asciiTheme="majorEastAsia" w:eastAsiaTheme="majorEastAsia" w:hAnsiTheme="majorEastAsia"/>
-          <w:color w:val="000000" w:themeColor="text1"/>
-          <w:sz w:val="22"/>
-          <w:szCs w:val="22"/>
-          <w:lang w:eastAsia="ko-KR"/>
-        </w:rPr>
-        <w:t xml:space="preserve">: 글로벌 뉴스 </w:t>
-      </w:r>
-      <w:proofErr w:type="spellStart"/>
-      <w:r>
-        <w:rPr>
-          <w:rFonts w:asciiTheme="majorEastAsia" w:eastAsiaTheme="majorEastAsia" w:hAnsiTheme="majorEastAsia"/>
-          <w:color w:val="000000" w:themeColor="text1"/>
-          <w:sz w:val="22"/>
-          <w:szCs w:val="22"/>
-          <w:lang w:eastAsia="ko-KR"/>
-        </w:rPr>
-        <w:t>티커</w:t>
-      </w:r>
-      <w:proofErr w:type="spellEnd"/>
-      <w:r>
-        <w:rPr>
-          <w:rFonts w:asciiTheme="majorEastAsia" w:eastAsiaTheme="majorEastAsia" w:hAnsiTheme="majorEastAsia"/>
-          <w:color w:val="000000" w:themeColor="text1"/>
-          <w:sz w:val="22"/>
-          <w:szCs w:val="22"/>
-          <w:lang w:eastAsia="ko-KR"/>
-        </w:rPr>
-        <w:t>, 감성 요약, 기사 개수, 클러스터</w:t>
+      <w:r>
+        <w:rPr>
+          <w:rFonts w:asciiTheme="majorEastAsia" w:eastAsiaTheme="majorEastAsia" w:hAnsiTheme="majorEastAsia"/>
+          <w:color w:val="000000" w:themeColor="text1"/>
+          <w:sz w:val="22"/>
+          <w:szCs w:val="22"/>
+          <w:lang w:eastAsia="ko-KR"/>
+        </w:rPr>
+        <w:t>: 글로벌 뉴스 티커, 감성 요약, 기사 개수, 클러스터</w:t>
       </w:r>
     </w:p>
     <w:p>
@@ -4178,29 +3159,7 @@
           <w:szCs w:val="22"/>
           <w:lang w:eastAsia="ko-KR"/>
         </w:rPr>
-        <w:t xml:space="preserve">: </w:t>
-      </w:r>
-      <w:proofErr w:type="spellStart"/>
-      <w:r>
-        <w:rPr>
-          <w:rFonts w:asciiTheme="majorEastAsia" w:eastAsiaTheme="majorEastAsia" w:hAnsiTheme="majorEastAsia"/>
-          <w:color w:val="000000" w:themeColor="text1"/>
-          <w:sz w:val="22"/>
-          <w:szCs w:val="22"/>
-          <w:lang w:eastAsia="ko-KR"/>
-        </w:rPr>
-        <w:t>프론트엔드</w:t>
-      </w:r>
-      <w:proofErr w:type="spellEnd"/>
-      <w:r>
-        <w:rPr>
-          <w:rFonts w:asciiTheme="majorEastAsia" w:eastAsiaTheme="majorEastAsia" w:hAnsiTheme="majorEastAsia"/>
-          <w:color w:val="000000" w:themeColor="text1"/>
-          <w:sz w:val="22"/>
-          <w:szCs w:val="22"/>
-          <w:lang w:eastAsia="ko-KR"/>
-        </w:rPr>
-        <w:t xml:space="preserve"> UI/UX 설계 및 구현</w:t>
+        <w:t>: 프론트엔드 UI/UX 설계 및 구현</w:t>
       </w:r>
     </w:p>
     <w:p>
@@ -4223,59 +3182,8 @@
           <w:sz w:val="28"/>
           <w:szCs w:val="28"/>
         </w:rPr>
-        <w:t xml:space="preserve">10. </w:t>
-      </w:r>
-      <w:proofErr w:type="spellStart"/>
-      <w:r>
-        <w:rPr>
-          <w:rFonts w:asciiTheme="majorEastAsia" w:hAnsiTheme="majorEastAsia"/>
-          <w:color w:val="000000" w:themeColor="text1"/>
-          <w:sz w:val="28"/>
-          <w:szCs w:val="28"/>
-        </w:rPr>
-        <w:t>향후</w:t>
-      </w:r>
-      <w:proofErr w:type="spellEnd"/>
-      <w:r>
-        <w:rPr>
-          <w:rFonts w:asciiTheme="majorEastAsia" w:hAnsiTheme="majorEastAsia"/>
-          <w:color w:val="000000" w:themeColor="text1"/>
-          <w:sz w:val="28"/>
-          <w:szCs w:val="28"/>
-        </w:rPr>
-        <w:t xml:space="preserve"> </w:t>
-      </w:r>
-      <w:proofErr w:type="spellStart"/>
-      <w:r>
-        <w:rPr>
-          <w:rFonts w:asciiTheme="majorEastAsia" w:hAnsiTheme="majorEastAsia"/>
-          <w:color w:val="000000" w:themeColor="text1"/>
-          <w:sz w:val="28"/>
-          <w:szCs w:val="28"/>
-        </w:rPr>
-        <w:t>확장</w:t>
-      </w:r>
-      <w:proofErr w:type="spellEnd"/>
-      <w:r>
-        <w:rPr>
-          <w:rFonts w:asciiTheme="majorEastAsia" w:hAnsiTheme="majorEastAsia"/>
-          <w:color w:val="000000" w:themeColor="text1"/>
-          <w:sz w:val="28"/>
-          <w:szCs w:val="28"/>
-        </w:rPr>
-        <w:t xml:space="preserve"> </w:t>
-      </w:r>
-      <w:proofErr w:type="spellStart"/>
-      <w:r>
-        <w:rPr>
-          <w:rFonts w:asciiTheme="majorEastAsia" w:hAnsiTheme="majorEastAsia"/>
-          <w:color w:val="000000" w:themeColor="text1"/>
-          <w:sz w:val="28"/>
-          <w:szCs w:val="28"/>
-        </w:rPr>
-        <w:t>계획</w:t>
-      </w:r>
-      <w:proofErr w:type="spellEnd"/>
+        <w:t>10. 향후 확장 계획</w:t>
+      </w:r>
     </w:p>
     <w:bookmarkEnd w:id="32"/>
     <w:p>
@@ -4303,65 +3211,17 @@
           <w:szCs w:val="22"/>
           <w:lang w:eastAsia="ko-KR"/>
         </w:rPr>
-        <w:t xml:space="preserve">멀티 </w:t>
-      </w:r>
-      <w:proofErr w:type="spellStart"/>
+        <w:t>멀티 모달 확장</w:t>
+      </w:r>
       <w:r>
         <w:rPr>
           <w:rFonts w:asciiTheme="majorEastAsia" w:eastAsiaTheme="majorEastAsia" w:hAnsiTheme="majorEastAsia" w:hint="eastAsia"/>
-          <w:b/>
-          <w:bCs/>
-          <w:color w:val="000000" w:themeColor="text1"/>
-          <w:sz w:val="22"/>
-          <w:szCs w:val="22"/>
-          <w:lang w:eastAsia="ko-KR"/>
-        </w:rPr>
-        <w:t>모달</w:t>
-      </w:r>
-      <w:proofErr w:type="spellEnd"/>
-      <w:r>
-        <w:rPr>
-          <w:rFonts w:asciiTheme="majorEastAsia" w:eastAsiaTheme="majorEastAsia" w:hAnsiTheme="majorEastAsia" w:hint="eastAsia"/>
-          <w:b/>
-          <w:bCs/>
-          <w:color w:val="000000" w:themeColor="text1"/>
-          <w:sz w:val="22"/>
-          <w:szCs w:val="22"/>
-          <w:lang w:eastAsia="ko-KR"/>
-        </w:rPr>
-        <w:t xml:space="preserve"> 확장</w:t>
-      </w:r>
-      <w:r>
-        <w:rPr>
-          <w:rFonts w:asciiTheme="majorEastAsia" w:eastAsiaTheme="majorEastAsia" w:hAnsiTheme="majorEastAsia" w:hint="eastAsia"/>
-          <w:color w:val="000000" w:themeColor="text1"/>
-          <w:sz w:val="22"/>
-          <w:szCs w:val="22"/>
-          <w:lang w:eastAsia="ko-KR"/>
-        </w:rPr>
-        <w:t xml:space="preserve">: 텍스트뿐 아니라 </w:t>
-      </w:r>
-      <w:proofErr w:type="spellStart"/>
-      <w:r>
-        <w:rPr>
-          <w:rFonts w:asciiTheme="majorEastAsia" w:eastAsiaTheme="majorEastAsia" w:hAnsiTheme="majorEastAsia" w:hint="eastAsia"/>
-          <w:color w:val="000000" w:themeColor="text1"/>
-          <w:sz w:val="22"/>
-          <w:szCs w:val="22"/>
-          <w:lang w:eastAsia="ko-KR"/>
-        </w:rPr>
-        <w:t>이미지·영상뉴스</w:t>
-      </w:r>
-      <w:proofErr w:type="spellEnd"/>
-      <w:r>
-        <w:rPr>
-          <w:rFonts w:asciiTheme="majorEastAsia" w:eastAsiaTheme="majorEastAsia" w:hAnsiTheme="majorEastAsia" w:hint="eastAsia"/>
-          <w:color w:val="000000" w:themeColor="text1"/>
-          <w:sz w:val="22"/>
-          <w:szCs w:val="22"/>
-          <w:lang w:eastAsia="ko-KR"/>
-        </w:rPr>
-        <w:t xml:space="preserve"> 분석까지 확대</w:t>
+          <w:color w:val="000000" w:themeColor="text1"/>
+          <w:sz w:val="22"/>
+          <w:szCs w:val="22"/>
+          <w:lang w:eastAsia="ko-KR"/>
+        </w:rPr>
+        <w:t>: 텍스트뿐 아니라 이미지·영상뉴스 분석까지 확대</w:t>
       </w:r>
     </w:p>
     <w:p>
@@ -4625,7 +3485,7 @@
         <w:pStyle w:val="Compact"/>
         <w:ind w:left="240"/>
         <w:rPr>
-          <w:rFonts w:asciiTheme="majorEastAsia" w:eastAsiaTheme="majorEastAsia" w:hAnsiTheme="majorEastAsia" w:hint="eastAsia"/>
+          <w:rFonts w:asciiTheme="majorEastAsia" w:eastAsiaTheme="majorEastAsia" w:hAnsiTheme="majorEastAsia"/>
           <w:color w:val="000000" w:themeColor="text1"/>
           <w:sz w:val="22"/>
           <w:szCs w:val="22"/>
@@ -5624,6 +4484,7 @@
   <w:style w:type="character" w:default="1" w:styleId="a1">
     <w:name w:val="Default Paragraph Font"/>
     <w:uiPriority w:val="1"/>
+    <w:semiHidden/>
     <w:unhideWhenUsed/>
   </w:style>
   <w:style w:type="table" w:default="1" w:styleId="a2">

</xml_diff>